<commit_message>
mise a jour document definitions
</commit_message>
<xml_diff>
--- a/doc/C61_-_Document_de_definition_L_Attaque.docx
+++ b/doc/C61_-_Document_de_definition_L_Attaque.docx
@@ -1,6 +1,6 @@
 
 <file path=word/document.xml><?xml version="1.0" encoding="utf-8"?>
-<w:document xmlns:wpc="http://schemas.microsoft.com/office/word/2010/wordprocessingCanvas" xmlns:cx="http://schemas.microsoft.com/office/drawing/2014/chartex" xmlns:cx1="http://schemas.microsoft.com/office/drawing/2015/9/8/chartex" xmlns:cx2="http://schemas.microsoft.com/office/drawing/2015/10/21/chartex" xmlns:cx3="http://schemas.microsoft.com/office/drawing/2016/5/9/chartex" xmlns:cx4="http://schemas.microsoft.com/office/drawing/2016/5/10/chartex" xmlns:cx5="http://schemas.microsoft.com/office/drawing/2016/5/11/chartex" xmlns:cx6="http://schemas.microsoft.com/office/drawing/2016/5/12/chartex" xmlns:cx7="http://schemas.microsoft.com/office/drawing/2016/5/13/chartex" xmlns:cx8="http://schemas.microsoft.com/office/drawing/2016/5/14/chartex" xmlns:mc="http://schemas.openxmlformats.org/markup-compatibility/2006" xmlns:aink="http://schemas.microsoft.com/office/drawing/2016/ink" xmlns:am3d="http://schemas.microsoft.com/office/drawing/2017/model3d" xmlns:o="urn:schemas-microsoft-com:office:office" xmlns:r="http://schemas.openxmlformats.org/officeDocument/2006/relationships" xmlns:m="http://schemas.openxmlformats.org/officeDocument/2006/math" xmlns:v="urn:schemas-microsoft-com:vml" xmlns:wp14="http://schemas.microsoft.com/office/word/2010/wordprocessingDrawing" xmlns:wp="http://schemas.openxmlformats.org/drawingml/2006/wordprocessingDrawing" xmlns:w10="urn:schemas-microsoft-com:office:word" xmlns:w="http://schemas.openxmlformats.org/wordprocessingml/2006/main" xmlns:w14="http://schemas.microsoft.com/office/word/2010/wordml" xmlns:w15="http://schemas.microsoft.com/office/word/2012/wordml" xmlns:w16cid="http://schemas.microsoft.com/office/word/2016/wordml/cid" xmlns:w16se="http://schemas.microsoft.com/office/word/2015/wordml/symex" xmlns:wpg="http://schemas.microsoft.com/office/word/2010/wordprocessingGroup" xmlns:wpi="http://schemas.microsoft.com/office/word/2010/wordprocessingInk" xmlns:wne="http://schemas.microsoft.com/office/word/2006/wordml" xmlns:wps="http://schemas.microsoft.com/office/word/2010/wordprocessingShape" mc:Ignorable="w14 w15 w16se w16cid wp14">
+<w:document xmlns:wpc="http://schemas.microsoft.com/office/word/2010/wordprocessingCanvas" xmlns:cx="http://schemas.microsoft.com/office/drawing/2014/chartex" xmlns:cx1="http://schemas.microsoft.com/office/drawing/2015/9/8/chartex" xmlns:cx2="http://schemas.microsoft.com/office/drawing/2015/10/21/chartex" xmlns:cx3="http://schemas.microsoft.com/office/drawing/2016/5/9/chartex" xmlns:cx4="http://schemas.microsoft.com/office/drawing/2016/5/10/chartex" xmlns:cx5="http://schemas.microsoft.com/office/drawing/2016/5/11/chartex" xmlns:cx6="http://schemas.microsoft.com/office/drawing/2016/5/12/chartex" xmlns:cx7="http://schemas.microsoft.com/office/drawing/2016/5/13/chartex" xmlns:cx8="http://schemas.microsoft.com/office/drawing/2016/5/14/chartex" xmlns:mc="http://schemas.openxmlformats.org/markup-compatibility/2006" xmlns:aink="http://schemas.microsoft.com/office/drawing/2016/ink" xmlns:am3d="http://schemas.microsoft.com/office/drawing/2017/model3d" xmlns:o="urn:schemas-microsoft-com:office:office" xmlns:oel="http://schemas.microsoft.com/office/2019/extlst" xmlns:r="http://schemas.openxmlformats.org/officeDocument/2006/relationships" xmlns:m="http://schemas.openxmlformats.org/officeDocument/2006/math" xmlns:v="urn:schemas-microsoft-com:vml" xmlns:wp14="http://schemas.microsoft.com/office/word/2010/wordprocessingDrawing" xmlns:wp="http://schemas.openxmlformats.org/drawingml/2006/wordprocessingDrawing" xmlns:w10="urn:schemas-microsoft-com:office:word" xmlns:w="http://schemas.openxmlformats.org/wordprocessingml/2006/main" xmlns:w14="http://schemas.microsoft.com/office/word/2010/wordml" xmlns:w15="http://schemas.microsoft.com/office/word/2012/wordml" xmlns:w16cex="http://schemas.microsoft.com/office/word/2018/wordml/cex" xmlns:w16cid="http://schemas.microsoft.com/office/word/2016/wordml/cid" xmlns:w16="http://schemas.microsoft.com/office/word/2018/wordml" xmlns:w16du="http://schemas.microsoft.com/office/word/2023/wordml/word16du" xmlns:w16sdtdh="http://schemas.microsoft.com/office/word/2020/wordml/sdtdatahash" xmlns:w16sdtfl="http://schemas.microsoft.com/office/word/2024/wordml/sdtformatlock" xmlns:w16se="http://schemas.microsoft.com/office/word/2015/wordml/symex" xmlns:wpg="http://schemas.microsoft.com/office/word/2010/wordprocessingGroup" xmlns:wpi="http://schemas.microsoft.com/office/word/2010/wordprocessingInk" xmlns:wne="http://schemas.microsoft.com/office/word/2006/wordml" xmlns:wps="http://schemas.microsoft.com/office/word/2010/wordprocessingShape" mc:Ignorable="w14 w15 w16se w16cid w16 w16cex w16sdtdh w16sdtfl w16du wp14">
   <w:body>
     <w:p>
       <w:pPr>
@@ -195,8 +195,14 @@
       <w:pPr>
         <w:pStyle w:val="Titre"/>
         <w:jc w:val="center"/>
-      </w:pPr>
-      <w:r>
+        <w:rPr>
+          <w:lang w:val="fr-CA"/>
+        </w:rPr>
+      </w:pPr>
+      <w:r>
+        <w:rPr>
+          <w:lang w:val="fr-CA"/>
+        </w:rPr>
         <w:t>Document de définition</w:t>
       </w:r>
     </w:p>
@@ -204,18 +210,31 @@
       <w:pPr>
         <w:pStyle w:val="Sous-titre"/>
         <w:jc w:val="center"/>
-      </w:pPr>
-      <w:r>
+        <w:rPr>
+          <w:lang w:val="fr-CA"/>
+        </w:rPr>
+      </w:pPr>
+      <w:r>
+        <w:rPr>
+          <w:lang w:val="fr-CA"/>
+        </w:rPr>
         <w:t>Exigences utilisateurs et spécifications fonctionnelles</w:t>
       </w:r>
     </w:p>
-    <w:p/>
+    <w:p>
+      <w:pPr>
+        <w:rPr>
+          <w:lang w:val="fr-CA"/>
+        </w:rPr>
+      </w:pPr>
+    </w:p>
     <w:p>
       <w:pPr>
         <w:pStyle w:val="Titre2"/>
         <w:rPr>
           <w:rStyle w:val="lev"/>
           <w:u w:val="single"/>
+          <w:lang w:val="fr-CA"/>
         </w:rPr>
       </w:pPr>
       <w:bookmarkStart w:id="0" w:name="_cky72jiyyf2z" w:colFirst="0" w:colLast="0"/>
@@ -224,6 +243,7 @@
         <w:rPr>
           <w:rStyle w:val="lev"/>
           <w:u w:val="single"/>
+          <w:lang w:val="fr-CA"/>
         </w:rPr>
         <w:t>Introduction:</w:t>
       </w:r>
@@ -236,14 +256,34 @@
           <w:numId w:val="10"/>
         </w:numPr>
       </w:pPr>
+      <w:proofErr w:type="spellStart"/>
       <w:r>
         <w:rPr>
           <w:rStyle w:val="lev"/>
           <w:b w:val="0"/>
           <w:bCs w:val="0"/>
         </w:rPr>
-        <w:t>Contexte du projet</w:t>
-      </w:r>
+        <w:t>Contexte</w:t>
+      </w:r>
+      <w:proofErr w:type="spellEnd"/>
+      <w:r>
+        <w:rPr>
+          <w:rStyle w:val="lev"/>
+          <w:b w:val="0"/>
+          <w:bCs w:val="0"/>
+        </w:rPr>
+        <w:t xml:space="preserve"> du </w:t>
+      </w:r>
+      <w:proofErr w:type="spellStart"/>
+      <w:r>
+        <w:rPr>
+          <w:rStyle w:val="lev"/>
+          <w:b w:val="0"/>
+          <w:bCs w:val="0"/>
+        </w:rPr>
+        <w:t>projet</w:t>
+      </w:r>
+      <w:proofErr w:type="spellEnd"/>
     </w:p>
     <w:p>
       <w:pPr>
@@ -262,7 +302,27 @@
           <w:szCs w:val="22"/>
           <w:lang w:val="fr-CA"/>
         </w:rPr>
-        <w:t xml:space="preserve">Le projet consiste à concevoir une version web du jeu de société Stratego, un classique du jeu de stratégie dans lequel deux joueurs s’affrontent pour capturer le drapeau adverse. L’objectif est de moderniser ce jeu en le rendant accessible via un navigateur web, tout en gardant ses règles et son côté stratégique. Ce projet s'inscrit dans le cours de synthèse et permet </w:t>
+        <w:t xml:space="preserve">Le projet consiste à concevoir une version web du jeu de société </w:t>
+      </w:r>
+      <w:proofErr w:type="spellStart"/>
+      <w:r>
+        <w:rPr>
+          <w:color w:val="auto"/>
+          <w:sz w:val="22"/>
+          <w:szCs w:val="22"/>
+          <w:lang w:val="fr-CA"/>
+        </w:rPr>
+        <w:t>Stratego</w:t>
+      </w:r>
+      <w:proofErr w:type="spellEnd"/>
+      <w:r>
+        <w:rPr>
+          <w:color w:val="auto"/>
+          <w:sz w:val="22"/>
+          <w:szCs w:val="22"/>
+          <w:lang w:val="fr-CA"/>
+        </w:rPr>
+        <w:t xml:space="preserve">, un classique du jeu de stratégie dans lequel deux joueurs s’affrontent pour capturer le drapeau adverse. L’objectif est de moderniser ce jeu en le rendant accessible via un navigateur web, tout en gardant ses règles et son côté stratégique. Ce projet s'inscrit dans le cours de synthèse et permet </w:t>
       </w:r>
       <w:r>
         <w:rPr>
@@ -314,6 +374,7 @@
           <w:bCs w:val="0"/>
         </w:rPr>
       </w:pPr>
+      <w:proofErr w:type="spellStart"/>
       <w:r>
         <w:rPr>
           <w:rStyle w:val="lev"/>
@@ -322,25 +383,72 @@
         </w:rPr>
         <w:t>Présentation</w:t>
       </w:r>
+      <w:proofErr w:type="spellEnd"/>
     </w:p>
     <w:p>
       <w:pPr>
         <w:jc w:val="both"/>
-      </w:pPr>
-      <w:r>
-        <w:t xml:space="preserve">L'objectif de ce projet est de créer une version Web interactive du jeu Stratego, offrant un mode solo contre une intelligence artificielle et un mode multijoueur en un contre un. Le jeu propose une expérience </w:t>
-      </w:r>
-      <w:r>
+        <w:rPr>
+          <w:lang w:val="fr-CA"/>
+        </w:rPr>
+      </w:pPr>
+      <w:r>
+        <w:rPr>
+          <w:lang w:val="fr-CA"/>
+        </w:rPr>
+        <w:t xml:space="preserve">L'objectif de ce projet est de créer une version Web interactive du jeu </w:t>
+      </w:r>
+      <w:proofErr w:type="spellStart"/>
+      <w:r>
+        <w:rPr>
+          <w:lang w:val="fr-CA"/>
+        </w:rPr>
+        <w:t>Stratego</w:t>
+      </w:r>
+      <w:proofErr w:type="spellEnd"/>
+      <w:r>
+        <w:rPr>
+          <w:lang w:val="fr-CA"/>
+        </w:rPr>
+        <w:t xml:space="preserve">, offrant un mode solo contre une intelligence artificielle et un mode multijoueur en un contre un. Le jeu propose une expérience </w:t>
+      </w:r>
+      <w:r>
+        <w:rPr>
+          <w:lang w:val="fr-CA"/>
+        </w:rPr>
         <w:t xml:space="preserve">fluide </w:t>
       </w:r>
       <w:r>
+        <w:rPr>
+          <w:lang w:val="fr-CA"/>
+        </w:rPr>
         <w:t xml:space="preserve">sur une grille de 10x10 cases où les joueurs déplacent des pièces dont l'identité reste masquée pour l'adversaire afin de préserver l'aspect tactique. Le projet inclut une interface </w:t>
       </w:r>
       <w:r>
+        <w:rPr>
+          <w:lang w:val="fr-CA"/>
+        </w:rPr>
         <w:t>réactive adaptée à plusieurs tailles d'écran</w:t>
       </w:r>
       <w:r>
-        <w:t>, un système de classement (leaderboard), ainsi qu'une fonctionnalité permettant de mettre en pause une partie contre l'IA pour la reprendre à tout moment.</w:t>
+        <w:rPr>
+          <w:lang w:val="fr-CA"/>
+        </w:rPr>
+        <w:t>, un système de classement (</w:t>
+      </w:r>
+      <w:proofErr w:type="spellStart"/>
+      <w:r>
+        <w:rPr>
+          <w:lang w:val="fr-CA"/>
+        </w:rPr>
+        <w:t>leaderboard</w:t>
+      </w:r>
+      <w:proofErr w:type="spellEnd"/>
+      <w:r>
+        <w:rPr>
+          <w:lang w:val="fr-CA"/>
+        </w:rPr>
+        <w:t>), ainsi qu'une fonctionnalité permettant de mettre en pause une partie contre l'IA pour la reprendre à tout moment.</w:t>
       </w:r>
     </w:p>
     <w:p>
@@ -383,8 +491,17 @@
           <w:rStyle w:val="lev"/>
           <w:u w:val="single"/>
         </w:rPr>
-        <w:t>Description générale</w:t>
-      </w:r>
+        <w:t xml:space="preserve">Description </w:t>
+      </w:r>
+      <w:proofErr w:type="spellStart"/>
+      <w:r>
+        <w:rPr>
+          <w:rStyle w:val="lev"/>
+          <w:u w:val="single"/>
+        </w:rPr>
+        <w:t>générale</w:t>
+      </w:r>
+      <w:proofErr w:type="spellEnd"/>
     </w:p>
     <w:p>
       <w:pPr>
@@ -405,48 +522,64 @@
           <w:b w:val="0"/>
           <w:bCs w:val="0"/>
         </w:rPr>
-        <w:t>Aperçu du logiciel</w:t>
-      </w:r>
-    </w:p>
-    <w:p>
-      <w:r>
-        <w:t xml:space="preserve">Ce projet est une </w:t>
-      </w:r>
-      <w:r>
-        <w:t>version numérique du jeu de stratégie Stratego,</w:t>
-      </w:r>
-      <w:r>
-        <w:t xml:space="preserve"> conçue pour être jouée directement dans un navigateur web. Le jeu se </w:t>
-      </w:r>
-      <w:r>
-        <w:t>déroule sur une grille de 10×10 cases, où</w:t>
-      </w:r>
-      <w:r>
-        <w:t xml:space="preserve"> deux joueurs s'affrontent en contrôlant chacun une armée de 40 pièces.</w:t>
-      </w:r>
-    </w:p>
-    <w:p/>
-    <w:p>
-      <w:r>
-        <w:t xml:space="preserve">L'objectif principal est de capturer le drapeau adverse ou, </w:t>
-      </w:r>
-      <w:r>
-        <w:t xml:space="preserve">par </w:t>
-      </w:r>
-      <w:r>
-        <w:t xml:space="preserve">défaut, d'éliminer toutes les pièces </w:t>
-      </w:r>
-      <w:r>
-        <w:t>de son adversaire</w:t>
-      </w:r>
-      <w:r>
-        <w:t xml:space="preserve">. Chaque joueur doit utiliser des stratégies de placement et de mouvement pour deviner </w:t>
-      </w:r>
-      <w:r>
-        <w:t xml:space="preserve">la tactique </w:t>
-      </w:r>
-      <w:r>
-        <w:t>de l'adversaire, tout en protégeant ses propres pièces.</w:t>
+        <w:t xml:space="preserve">Aperçu du </w:t>
+      </w:r>
+      <w:proofErr w:type="spellStart"/>
+      <w:r>
+        <w:rPr>
+          <w:rStyle w:val="lev"/>
+          <w:b w:val="0"/>
+          <w:bCs w:val="0"/>
+        </w:rPr>
+        <w:t>logiciel</w:t>
+      </w:r>
+      <w:proofErr w:type="spellEnd"/>
+    </w:p>
+    <w:p>
+      <w:pPr>
+        <w:rPr>
+          <w:lang w:val="fr-CA"/>
+        </w:rPr>
+      </w:pPr>
+      <w:r>
+        <w:rPr>
+          <w:lang w:val="fr-CA"/>
+        </w:rPr>
+        <w:t xml:space="preserve">Ce projet est une version numérique du jeu de stratégie </w:t>
+      </w:r>
+      <w:proofErr w:type="spellStart"/>
+      <w:r>
+        <w:rPr>
+          <w:lang w:val="fr-CA"/>
+        </w:rPr>
+        <w:t>Stratego</w:t>
+      </w:r>
+      <w:proofErr w:type="spellEnd"/>
+      <w:r>
+        <w:rPr>
+          <w:lang w:val="fr-CA"/>
+        </w:rPr>
+        <w:t>, conçue pour être jouée directement dans un navigateur web. Le jeu se déroule sur une grille de 10×10 cases, où deux joueurs s'affrontent en contrôlant chacun une armée de 40 pièces.</w:t>
+      </w:r>
+    </w:p>
+    <w:p>
+      <w:pPr>
+        <w:rPr>
+          <w:lang w:val="fr-CA"/>
+        </w:rPr>
+      </w:pPr>
+    </w:p>
+    <w:p>
+      <w:pPr>
+        <w:rPr>
+          <w:lang w:val="fr-CA"/>
+        </w:rPr>
+      </w:pPr>
+      <w:r>
+        <w:rPr>
+          <w:lang w:val="fr-CA"/>
+        </w:rPr>
+        <w:t>L'objectif principal est de capturer le drapeau adverse ou, par défaut, d'éliminer toutes les pièces de son adversaire. Chaque joueur doit utiliser des stratégies de placement et de mouvement pour deviner la tactique de l'adversaire, tout en protégeant ses propres pièces.</w:t>
       </w:r>
     </w:p>
     <w:p>
@@ -476,7 +609,6 @@
           <w:rFonts w:ascii="Arial" w:eastAsia="Arial" w:hAnsi="Arial" w:cs="Arial"/>
           <w:sz w:val="22"/>
           <w:szCs w:val="22"/>
-          <w:lang w:val="en"/>
         </w:rPr>
       </w:pPr>
       <w:r>
@@ -497,7 +629,6 @@
           <w:rFonts w:ascii="Arial" w:eastAsia="Arial" w:hAnsi="Arial" w:cs="Arial"/>
           <w:sz w:val="22"/>
           <w:szCs w:val="22"/>
-          <w:lang w:val="en"/>
         </w:rPr>
         <w:t xml:space="preserve">Chaque joueur place ses </w:t>
       </w:r>
@@ -506,7 +637,6 @@
           <w:rFonts w:ascii="Arial" w:eastAsia="Arial" w:hAnsi="Arial" w:cs="Arial"/>
           <w:sz w:val="22"/>
           <w:szCs w:val="22"/>
-          <w:lang w:val="en"/>
         </w:rPr>
         <w:t>40 pièces</w:t>
       </w:r>
@@ -515,7 +645,6 @@
           <w:rFonts w:ascii="Arial" w:eastAsia="Arial" w:hAnsi="Arial" w:cs="Arial"/>
           <w:sz w:val="22"/>
           <w:szCs w:val="22"/>
-          <w:lang w:val="en"/>
         </w:rPr>
         <w:t xml:space="preserve"> sur </w:t>
       </w:r>
@@ -524,7 +653,6 @@
           <w:rFonts w:ascii="Arial" w:eastAsia="Arial" w:hAnsi="Arial" w:cs="Arial"/>
           <w:sz w:val="22"/>
           <w:szCs w:val="22"/>
-          <w:lang w:val="en"/>
         </w:rPr>
         <w:t>l</w:t>
       </w:r>
@@ -533,7 +661,6 @@
           <w:rFonts w:ascii="Arial" w:eastAsia="Arial" w:hAnsi="Arial" w:cs="Arial"/>
           <w:sz w:val="22"/>
           <w:szCs w:val="22"/>
-          <w:lang w:val="en"/>
         </w:rPr>
         <w:t>es quatre rangées</w:t>
       </w:r>
@@ -542,16 +669,32 @@
           <w:rFonts w:ascii="Arial" w:eastAsia="Arial" w:hAnsi="Arial" w:cs="Arial"/>
           <w:sz w:val="22"/>
           <w:szCs w:val="22"/>
-          <w:lang w:val="en"/>
-        </w:rPr>
-        <w:t xml:space="preserve"> face a lui</w:t>
-      </w:r>
-      <w:r>
-        <w:rPr>
-          <w:rFonts w:ascii="Arial" w:eastAsia="Arial" w:hAnsi="Arial" w:cs="Arial"/>
-          <w:sz w:val="22"/>
-          <w:szCs w:val="22"/>
-          <w:lang w:val="en"/>
+        </w:rPr>
+        <w:t xml:space="preserve"> face </w:t>
+      </w:r>
+      <w:proofErr w:type="spellStart"/>
+      <w:r>
+        <w:rPr>
+          <w:rFonts w:ascii="Arial" w:eastAsia="Arial" w:hAnsi="Arial" w:cs="Arial"/>
+          <w:sz w:val="22"/>
+          <w:szCs w:val="22"/>
+        </w:rPr>
+        <w:t>a</w:t>
+      </w:r>
+      <w:proofErr w:type="spellEnd"/>
+      <w:r>
+        <w:rPr>
+          <w:rFonts w:ascii="Arial" w:eastAsia="Arial" w:hAnsi="Arial" w:cs="Arial"/>
+          <w:sz w:val="22"/>
+          <w:szCs w:val="22"/>
+        </w:rPr>
+        <w:t xml:space="preserve"> lui</w:t>
+      </w:r>
+      <w:r>
+        <w:rPr>
+          <w:rFonts w:ascii="Arial" w:eastAsia="Arial" w:hAnsi="Arial" w:cs="Arial"/>
+          <w:sz w:val="22"/>
+          <w:szCs w:val="22"/>
         </w:rPr>
         <w:t xml:space="preserve">. </w:t>
       </w:r>
@@ -560,7 +703,6 @@
           <w:rFonts w:ascii="Arial" w:eastAsia="Arial" w:hAnsi="Arial" w:cs="Arial"/>
           <w:sz w:val="22"/>
           <w:szCs w:val="22"/>
-          <w:lang w:val="en"/>
         </w:rPr>
         <w:t>Ce placement stratégique détermine la disposition initiale de l’armée et influence directement le déroulement de la partie.</w:t>
       </w:r>
@@ -609,7 +751,6 @@
           <w:rFonts w:ascii="Arial" w:eastAsia="Arial" w:hAnsi="Arial" w:cs="Arial"/>
           <w:sz w:val="22"/>
           <w:szCs w:val="22"/>
-          <w:lang w:val="en"/>
         </w:rPr>
         <w:t>Les joueurs alternent les tours pour déplacer une pièce à la fois. L’identité des pièces</w:t>
       </w:r>
@@ -618,7 +759,6 @@
           <w:rFonts w:ascii="Arial" w:eastAsia="Arial" w:hAnsi="Arial" w:cs="Arial"/>
           <w:sz w:val="22"/>
           <w:szCs w:val="22"/>
-          <w:lang w:val="en"/>
         </w:rPr>
         <w:t xml:space="preserve"> adverses</w:t>
       </w:r>
@@ -627,7 +767,6 @@
           <w:rFonts w:ascii="Arial" w:eastAsia="Arial" w:hAnsi="Arial" w:cs="Arial"/>
           <w:sz w:val="22"/>
           <w:szCs w:val="22"/>
-          <w:lang w:val="en"/>
         </w:rPr>
         <w:t xml:space="preserve"> est masquée jusqu’à ce qu’un combat soit déclenché.</w:t>
       </w:r>
@@ -658,90 +797,117 @@
           <w:rFonts w:ascii="Arial" w:eastAsia="Arial" w:hAnsi="Arial" w:cs="Arial"/>
           <w:sz w:val="22"/>
           <w:szCs w:val="22"/>
+        </w:rPr>
+        <w:t>Lorsqu’une pièce tente d’occuper une case occupée par une pièce adverse, le programme compare automatiquement le grade des pièces combattantes pour déterminer le vainqueur. Les combats reposent sur une hiérarchie de grades inspirée du principe « Pierre-Feuille-Ciseaux ». En général, la pièce au rang le plus élevé l'emporte, mais il existe des exceptions créant un cycle de supériorité : l'</w:t>
+      </w:r>
+      <w:r>
+        <w:rPr>
+          <w:rFonts w:ascii="Arial" w:eastAsia="Arial" w:hAnsi="Arial" w:cs="Arial"/>
+          <w:sz w:val="22"/>
+          <w:szCs w:val="22"/>
+        </w:rPr>
+        <w:t>E</w:t>
+      </w:r>
+      <w:r>
+        <w:rPr>
+          <w:rFonts w:ascii="Arial" w:eastAsia="Arial" w:hAnsi="Arial" w:cs="Arial"/>
+          <w:sz w:val="22"/>
+          <w:szCs w:val="22"/>
+        </w:rPr>
+        <w:t xml:space="preserve">spion peut vaincre le </w:t>
+      </w:r>
+      <w:r>
+        <w:rPr>
+          <w:rFonts w:ascii="Arial" w:eastAsia="Arial" w:hAnsi="Arial" w:cs="Arial"/>
+          <w:sz w:val="22"/>
+          <w:szCs w:val="22"/>
+        </w:rPr>
+        <w:t>M</w:t>
+      </w:r>
+      <w:r>
+        <w:rPr>
+          <w:rFonts w:ascii="Arial" w:eastAsia="Arial" w:hAnsi="Arial" w:cs="Arial"/>
+          <w:sz w:val="22"/>
+          <w:szCs w:val="22"/>
+        </w:rPr>
+        <w:t xml:space="preserve">aréchal s'il l'attaque en premier, et le Démineur est le seul capable de </w:t>
+      </w:r>
+      <w:r>
+        <w:rPr>
+          <w:rFonts w:ascii="Arial" w:eastAsia="Arial" w:hAnsi="Arial" w:cs="Arial"/>
+          <w:sz w:val="22"/>
+          <w:szCs w:val="22"/>
+        </w:rPr>
+        <w:t>désamorcer</w:t>
+      </w:r>
+      <w:r>
+        <w:rPr>
+          <w:rFonts w:ascii="Arial" w:eastAsia="Arial" w:hAnsi="Arial" w:cs="Arial"/>
+          <w:sz w:val="22"/>
+          <w:szCs w:val="22"/>
+        </w:rPr>
+        <w:t xml:space="preserve"> </w:t>
+      </w:r>
+      <w:r>
+        <w:rPr>
+          <w:rFonts w:ascii="Arial" w:eastAsia="Arial" w:hAnsi="Arial" w:cs="Arial"/>
+          <w:sz w:val="22"/>
+          <w:szCs w:val="22"/>
+        </w:rPr>
+        <w:t>une</w:t>
+      </w:r>
+      <w:r>
+        <w:rPr>
+          <w:rFonts w:ascii="Arial" w:eastAsia="Arial" w:hAnsi="Arial" w:cs="Arial"/>
+          <w:sz w:val="22"/>
+          <w:szCs w:val="22"/>
+        </w:rPr>
+        <w:t xml:space="preserve"> bombe.</w:t>
+      </w:r>
+    </w:p>
+    <w:p>
+      <w:pPr>
+        <w:pStyle w:val="whitespace-break-spaces"/>
+        <w:numPr>
+          <w:ilvl w:val="0"/>
+          <w:numId w:val="11"/>
+        </w:numPr>
+        <w:spacing w:after="120" w:afterAutospacing="0"/>
+        <w:ind w:left="714" w:hanging="357"/>
+        <w:jc w:val="both"/>
+      </w:pPr>
+      <w:r>
+        <w:rPr>
+          <w:rStyle w:val="lev"/>
+          <w:rFonts w:ascii="Arial" w:hAnsi="Arial" w:cs="Arial"/>
+        </w:rPr>
+        <w:t xml:space="preserve">Fin de jeu : </w:t>
+      </w:r>
+      <w:commentRangeStart w:id="1"/>
+      <w:r>
+        <w:rPr>
+          <w:rFonts w:ascii="Arial" w:eastAsia="Arial" w:hAnsi="Arial" w:cs="Arial"/>
+          <w:sz w:val="22"/>
+          <w:szCs w:val="22"/>
+        </w:rPr>
+        <w:t>Le jeu se termine soit si le drapeau d’un joueur est capturé, soit si un joueur n’a plus de mouvements légaux possible</w:t>
+      </w:r>
+      <w:commentRangeEnd w:id="1"/>
+      <w:r>
+        <w:rPr>
+          <w:rStyle w:val="Marquedecommentaire"/>
+          <w:rFonts w:ascii="Arial" w:eastAsia="Arial" w:hAnsi="Arial" w:cs="Arial"/>
           <w:lang w:val="en"/>
         </w:rPr>
-        <w:t>Lorsqu’une pièce tente d’occuper une case occupée par une pièce adverse, le programme compare automatiquement le grade des pièces combattantes pour déterminer le vainqueur. Les combats reposent sur une hiérarchie de grades inspirée du principe « Pierre-Feuille-Ciseaux ». En général, la pièce au rang le plus élevé l'emporte, mais il existe des exceptions créant un cycle de supériorité : l'</w:t>
-      </w:r>
-      <w:r>
-        <w:rPr>
-          <w:rFonts w:ascii="Arial" w:eastAsia="Arial" w:hAnsi="Arial" w:cs="Arial"/>
-          <w:sz w:val="22"/>
-          <w:szCs w:val="22"/>
-          <w:lang w:val="en"/>
-        </w:rPr>
-        <w:t>E</w:t>
-      </w:r>
-      <w:r>
-        <w:rPr>
-          <w:rFonts w:ascii="Arial" w:eastAsia="Arial" w:hAnsi="Arial" w:cs="Arial"/>
-          <w:sz w:val="22"/>
-          <w:szCs w:val="22"/>
-          <w:lang w:val="en"/>
-        </w:rPr>
-        <w:t xml:space="preserve">spion peut vaincre le </w:t>
-      </w:r>
-      <w:r>
-        <w:rPr>
-          <w:rFonts w:ascii="Arial" w:eastAsia="Arial" w:hAnsi="Arial" w:cs="Arial"/>
-          <w:sz w:val="22"/>
-          <w:szCs w:val="22"/>
-          <w:lang w:val="en"/>
-        </w:rPr>
-        <w:t>M</w:t>
-      </w:r>
-      <w:r>
-        <w:rPr>
-          <w:rFonts w:ascii="Arial" w:eastAsia="Arial" w:hAnsi="Arial" w:cs="Arial"/>
-          <w:sz w:val="22"/>
-          <w:szCs w:val="22"/>
-          <w:lang w:val="en"/>
-        </w:rPr>
-        <w:t xml:space="preserve">aréchal s'il l'attaque en premier, et le Démineur est le seul capable de </w:t>
-      </w:r>
-      <w:r>
-        <w:rPr>
-          <w:rFonts w:ascii="Arial" w:eastAsia="Arial" w:hAnsi="Arial" w:cs="Arial"/>
-          <w:sz w:val="22"/>
-          <w:szCs w:val="22"/>
-          <w:lang w:val="en"/>
-        </w:rPr>
-        <w:t>d</w:t>
-      </w:r>
-      <w:r>
-        <w:rPr>
-          <w:rFonts w:ascii="Arial" w:eastAsia="Arial" w:hAnsi="Arial" w:cs="Arial"/>
-          <w:sz w:val="22"/>
-          <w:szCs w:val="22"/>
-          <w:lang w:val="en"/>
-        </w:rPr>
-        <w:t>ésamorcer</w:t>
-      </w:r>
-      <w:r>
-        <w:rPr>
-          <w:rFonts w:ascii="Arial" w:eastAsia="Arial" w:hAnsi="Arial" w:cs="Arial"/>
-          <w:sz w:val="22"/>
-          <w:szCs w:val="22"/>
-          <w:lang w:val="en"/>
-        </w:rPr>
-        <w:t xml:space="preserve"> </w:t>
-      </w:r>
-      <w:r>
-        <w:rPr>
-          <w:rFonts w:ascii="Arial" w:eastAsia="Arial" w:hAnsi="Arial" w:cs="Arial"/>
-          <w:sz w:val="22"/>
-          <w:szCs w:val="22"/>
-          <w:lang w:val="en"/>
-        </w:rPr>
-        <w:t>une</w:t>
-      </w:r>
-      <w:r>
-        <w:rPr>
-          <w:rFonts w:ascii="Arial" w:eastAsia="Arial" w:hAnsi="Arial" w:cs="Arial"/>
-          <w:sz w:val="22"/>
-          <w:szCs w:val="22"/>
-          <w:lang w:val="en"/>
-        </w:rPr>
-        <w:t xml:space="preserve"> bombe.</w:t>
+        <w:commentReference w:id="1"/>
+      </w:r>
+      <w:r>
+        <w:rPr>
+          <w:rFonts w:ascii="Arial" w:eastAsia="Arial" w:hAnsi="Arial" w:cs="Arial"/>
+          <w:sz w:val="22"/>
+          <w:szCs w:val="22"/>
+        </w:rPr>
+        <w:t>.</w:t>
       </w:r>
     </w:p>
     <w:p>
@@ -751,14 +917,34 @@
           <w:rStyle w:val="lev"/>
         </w:rPr>
       </w:pPr>
+      <w:proofErr w:type="spellStart"/>
       <w:r>
         <w:rPr>
           <w:rStyle w:val="lev"/>
           <w:b w:val="0"/>
           <w:bCs w:val="0"/>
         </w:rPr>
-        <w:t>Fonctionnalités principales</w:t>
-      </w:r>
+        <w:t>Fonctionnalités</w:t>
+      </w:r>
+      <w:proofErr w:type="spellEnd"/>
+      <w:r>
+        <w:rPr>
+          <w:rStyle w:val="lev"/>
+          <w:b w:val="0"/>
+          <w:bCs w:val="0"/>
+        </w:rPr>
+        <w:t xml:space="preserve"> </w:t>
+      </w:r>
+      <w:proofErr w:type="spellStart"/>
+      <w:r>
+        <w:rPr>
+          <w:rStyle w:val="lev"/>
+          <w:b w:val="0"/>
+          <w:bCs w:val="0"/>
+        </w:rPr>
+        <w:t>principales</w:t>
+      </w:r>
+      <w:proofErr w:type="spellEnd"/>
     </w:p>
     <w:p>
       <w:pPr>
@@ -768,6 +954,9 @@
         </w:numPr>
         <w:spacing w:before="100" w:beforeAutospacing="1" w:after="120" w:line="240" w:lineRule="auto"/>
         <w:ind w:left="714" w:hanging="357"/>
+        <w:rPr>
+          <w:lang w:val="fr-CA"/>
+        </w:rPr>
       </w:pPr>
       <w:r>
         <w:rPr>
@@ -780,13 +969,22 @@
         <w:t>Mode solo contre une IA :</w:t>
       </w:r>
       <w:r>
-        <w:t xml:space="preserve"> </w:t>
-      </w:r>
-      <w:r>
-        <w:t xml:space="preserve">Possibilite de jouer contre un joueur simule par </w:t>
-      </w:r>
-      <w:r>
-        <w:t>une intelligence artificielle avec plusieurs niveaux de difficulté (facile, moyen, difficile).</w:t>
+        <w:rPr>
+          <w:lang w:val="fr-CA"/>
+        </w:rPr>
+        <w:t xml:space="preserve"> Possibilit</w:t>
+      </w:r>
+      <w:r>
+        <w:rPr>
+          <w:lang w:val="fr-CA"/>
+        </w:rPr>
+        <w:t>é</w:t>
+      </w:r>
+      <w:r>
+        <w:rPr>
+          <w:lang w:val="fr-CA"/>
+        </w:rPr>
+        <w:t xml:space="preserve"> de jouer contre un joueur simule par une intelligence artificielle avec plusieurs niveaux de difficulté (facile, moyen, difficile).</w:t>
       </w:r>
     </w:p>
     <w:p>
@@ -797,26 +995,48 @@
         </w:numPr>
         <w:spacing w:before="100" w:beforeAutospacing="1" w:after="120" w:line="240" w:lineRule="auto"/>
         <w:ind w:left="714" w:hanging="357"/>
+        <w:rPr>
+          <w:lang w:val="fr-CA"/>
+        </w:rPr>
       </w:pPr>
       <w:r>
         <w:rPr>
           <w:rStyle w:val="lev"/>
+          <w:rFonts w:eastAsia="Times New Roman"/>
+          <w:sz w:val="24"/>
+          <w:szCs w:val="24"/>
+          <w:lang w:val="fr-CA"/>
         </w:rPr>
         <w:t>Mode multijoueur en ligne</w:t>
       </w:r>
       <w:r>
+        <w:rPr>
+          <w:lang w:val="fr-CA"/>
+        </w:rPr>
         <w:t xml:space="preserve"> : Permet à deux joueurs </w:t>
       </w:r>
       <w:r>
+        <w:rPr>
+          <w:lang w:val="fr-CA"/>
+        </w:rPr>
         <w:t xml:space="preserve">humains </w:t>
       </w:r>
       <w:r>
+        <w:rPr>
+          <w:lang w:val="fr-CA"/>
+        </w:rPr>
         <w:t xml:space="preserve">de s’affronter en temps réel via </w:t>
       </w:r>
       <w:r>
+        <w:rPr>
+          <w:lang w:val="fr-CA"/>
+        </w:rPr>
         <w:t>internet</w:t>
       </w:r>
       <w:r>
+        <w:rPr>
+          <w:lang w:val="fr-CA"/>
+        </w:rPr>
         <w:t>.</w:t>
       </w:r>
     </w:p>
@@ -828,20 +1048,48 @@
         </w:numPr>
         <w:spacing w:before="100" w:beforeAutospacing="1" w:after="120" w:line="240" w:lineRule="auto"/>
         <w:ind w:left="714" w:hanging="357"/>
-      </w:pPr>
+        <w:rPr>
+          <w:lang w:val="fr-CA"/>
+        </w:rPr>
+      </w:pPr>
+      <w:proofErr w:type="spellStart"/>
       <w:r>
         <w:rPr>
           <w:rStyle w:val="lev"/>
+          <w:rFonts w:eastAsia="Times New Roman"/>
+          <w:sz w:val="24"/>
+          <w:szCs w:val="24"/>
+          <w:lang w:val="fr-CA"/>
         </w:rPr>
         <w:t>Leaderboard</w:t>
       </w:r>
-      <w:r>
-        <w:t xml:space="preserve"> : Classement des joueurs basé sur leurs victoires et </w:t>
-      </w:r>
-      <w:r>
+      <w:proofErr w:type="spellEnd"/>
+      <w:r>
+        <w:rPr>
+          <w:rStyle w:val="lev"/>
+          <w:rFonts w:eastAsia="Times New Roman"/>
+          <w:sz w:val="24"/>
+          <w:szCs w:val="24"/>
+          <w:lang w:val="fr-CA"/>
+        </w:rPr>
+        <w:t xml:space="preserve"> :</w:t>
+      </w:r>
+      <w:r>
+        <w:rPr>
+          <w:lang w:val="fr-CA"/>
+        </w:rPr>
+        <w:t xml:space="preserve"> Classement des joueurs basé sur leurs victoires et </w:t>
+      </w:r>
+      <w:r>
+        <w:rPr>
+          <w:lang w:val="fr-CA"/>
+        </w:rPr>
         <w:t xml:space="preserve">des points de </w:t>
       </w:r>
       <w:r>
+        <w:rPr>
+          <w:lang w:val="fr-CA"/>
+        </w:rPr>
         <w:t>performances.</w:t>
       </w:r>
     </w:p>
@@ -851,27 +1099,82 @@
           <w:ilvl w:val="0"/>
           <w:numId w:val="12"/>
         </w:numPr>
-        <w:spacing w:before="100" w:beforeAutospacing="1" w:after="100" w:afterAutospacing="1" w:line="240" w:lineRule="auto"/>
-      </w:pPr>
-      <w:r>
-        <w:rPr>
-          <w:rStyle w:val="lev"/>
-        </w:rPr>
-        <w:t>Sauvegarde et reprise</w:t>
-      </w:r>
-      <w:r>
-        <w:t xml:space="preserve"> : Option pour suspendre et reprendre une partie contre l’IA à tout moment.</w:t>
-      </w:r>
-    </w:p>
-    <w:p>
-      <w:pPr>
-        <w:spacing w:before="100" w:beforeAutospacing="1" w:after="100" w:afterAutospacing="1" w:line="240" w:lineRule="auto"/>
-      </w:pPr>
-    </w:p>
-    <w:p>
-      <w:pPr>
-        <w:spacing w:before="100" w:beforeAutospacing="1" w:after="100" w:afterAutospacing="1" w:line="240" w:lineRule="auto"/>
-      </w:pPr>
+        <w:spacing w:before="100" w:beforeAutospacing="1" w:after="120" w:line="240" w:lineRule="auto"/>
+        <w:ind w:left="714" w:hanging="357"/>
+        <w:rPr>
+          <w:lang w:val="fr-CA"/>
+        </w:rPr>
+      </w:pPr>
+      <w:r>
+        <w:rPr>
+          <w:b/>
+          <w:bCs/>
+          <w:lang w:val="fr-CA"/>
+        </w:rPr>
+        <w:t>Sauvegarde et reprise :</w:t>
+      </w:r>
+      <w:r>
+        <w:rPr>
+          <w:lang w:val="fr-CA"/>
+        </w:rPr>
+        <w:t xml:space="preserve"> Option pour suspendre et reprendre une partie contre l’IA à tout moment.</w:t>
+      </w:r>
+    </w:p>
+    <w:p>
+      <w:pPr>
+        <w:numPr>
+          <w:ilvl w:val="0"/>
+          <w:numId w:val="12"/>
+        </w:numPr>
+        <w:spacing w:before="100" w:beforeAutospacing="1" w:after="120" w:line="240" w:lineRule="auto"/>
+        <w:ind w:left="714" w:hanging="357"/>
+        <w:rPr>
+          <w:b/>
+          <w:bCs/>
+          <w:lang w:val="fr-CA"/>
+        </w:rPr>
+      </w:pPr>
+      <w:r>
+        <w:rPr>
+          <w:b/>
+          <w:bCs/>
+          <w:lang w:val="fr-CA"/>
+        </w:rPr>
+        <w:t xml:space="preserve">Chat : </w:t>
+      </w:r>
+      <w:r>
+        <w:rPr>
+          <w:lang w:val="fr-CA"/>
+        </w:rPr>
+        <w:t>Possibilité pour les joueurs de s’envoyer des messages en direct.</w:t>
+      </w:r>
+    </w:p>
+    <w:p>
+      <w:pPr>
+        <w:numPr>
+          <w:ilvl w:val="0"/>
+          <w:numId w:val="12"/>
+        </w:numPr>
+        <w:spacing w:before="100" w:beforeAutospacing="1" w:after="120" w:line="240" w:lineRule="auto"/>
+        <w:ind w:left="714" w:hanging="357"/>
+        <w:rPr>
+          <w:lang w:val="fr-CA"/>
+        </w:rPr>
+      </w:pPr>
+      <w:r>
+        <w:rPr>
+          <w:b/>
+          <w:bCs/>
+          <w:lang w:val="fr-CA"/>
+        </w:rPr>
+        <w:t>Assistance d’aide au jeu :</w:t>
+      </w:r>
+      <w:r>
+        <w:rPr>
+          <w:lang w:val="fr-CA"/>
+        </w:rPr>
+        <w:t xml:space="preserve">  Donne des conseils sur les déplacements recommandés par l’IA.</w:t>
+      </w:r>
     </w:p>
     <w:p>
       <w:pPr>
@@ -881,6 +1184,7 @@
           <w:rStyle w:val="lev"/>
           <w:b w:val="0"/>
           <w:bCs w:val="0"/>
+          <w:lang w:val="fr-CA"/>
         </w:rPr>
       </w:pPr>
       <w:r>
@@ -888,14 +1192,55 @@
           <w:rStyle w:val="lev"/>
           <w:b w:val="0"/>
           <w:bCs w:val="0"/>
+          <w:lang w:val="fr-CA"/>
         </w:rPr>
         <w:lastRenderedPageBreak/>
         <w:t>Interfaces utilisateur graphiques</w:t>
       </w:r>
     </w:p>
     <w:p>
-      <w:r>
-        <w:t>Le jeu est accessible via un navigateur web sur ordinateur, téléphone ou tablette, nécessitant une connexion Internet. Aucun matériel spécifique n'est requis pour son fonctionnement. À l’accueil du site, l’utilisateur accède à un menu principal lui permettant de choisir son mode de jeu (contre un autre joueur ou contre une IA), de configurer des options d’ergonomie et d’accéder au classement (leaderboard). Les interactions sont principalement axées sur l'utilisation de la souris ou du tactile grâce à des fonctions de glisser-déposer (drag-and-drop) pour le placement et le mouvement des pièces. Ces commandes sont complétées par des raccourcis clavier pour faciliter la navigation.</w:t>
+      <w:pPr>
+        <w:rPr>
+          <w:lang w:val="fr-CA"/>
+        </w:rPr>
+      </w:pPr>
+      <w:r>
+        <w:rPr>
+          <w:lang w:val="fr-CA"/>
+        </w:rPr>
+        <w:t xml:space="preserve">Le jeu est accessible via un navigateur web sur ordinateur, téléphone ou tablette, nécessitant une connexion Internet. Aucun matériel spécifique n'est requis pour son fonctionnement. À l’accueil du site, </w:t>
+      </w:r>
+      <w:r>
+        <w:rPr>
+          <w:lang w:val="fr-CA"/>
+        </w:rPr>
+        <w:t>l’utilisateur est invité à créer un compte s’il n’en possède pas un. Il devra ensuite se connecter à chaque utilisation pour accéder au jeu. L</w:t>
+      </w:r>
+      <w:r>
+        <w:rPr>
+          <w:lang w:val="fr-CA"/>
+        </w:rPr>
+        <w:t>’utilisateur accède à un menu principal lui permettant de choisir son mode de jeu (contre un autre joueur ou contre une IA), de configurer des options d’ergonomie et d’accéder au classement (</w:t>
+      </w:r>
+      <w:proofErr w:type="spellStart"/>
+      <w:r>
+        <w:rPr>
+          <w:lang w:val="fr-CA"/>
+        </w:rPr>
+        <w:t>leaderboard</w:t>
+      </w:r>
+      <w:proofErr w:type="spellEnd"/>
+      <w:r>
+        <w:rPr>
+          <w:lang w:val="fr-CA"/>
+        </w:rPr>
+        <w:t>). Les interactions sont principalement axées sur l'utilisation de la souris ou du tactile grâce à des fonctions de glisser-déposer (drag-and-drop) pour le placement et le mouvement des pièces. Ces commandes sont complétées par des raccourcis clavier pour faciliter la navigation.</w:t>
+      </w:r>
+      <w:r>
+        <w:rPr>
+          <w:lang w:val="fr-CA"/>
+        </w:rPr>
+        <w:t xml:space="preserve"> Lors d’une partie, le joueur peut appuyer sur une touche, ce qui affichera un menu contextuel qui lui permettra de quitter la partie en cours.</w:t>
       </w:r>
     </w:p>
     <w:p>
@@ -904,6 +1249,7 @@
         <w:rPr>
           <w:b/>
           <w:bCs/>
+          <w:lang w:val="fr-CA"/>
         </w:rPr>
       </w:pPr>
       <w:r>
@@ -911,49 +1257,63 @@
           <w:rStyle w:val="lev"/>
           <w:b w:val="0"/>
           <w:bCs w:val="0"/>
+          <w:lang w:val="fr-CA"/>
         </w:rPr>
         <w:t>Utilisateurs du logiciel</w:t>
       </w:r>
     </w:p>
     <w:p>
-      <w:r>
-        <w:t>L’Attaque</w:t>
-      </w:r>
-      <w:r>
-        <w:t xml:space="preserve"> s'adresse aux amateurs de jeux de </w:t>
-      </w:r>
-      <w:r>
-        <w:t xml:space="preserve">plateaux </w:t>
-      </w:r>
-      <w:r>
-        <w:t xml:space="preserve">classiques, </w:t>
-      </w:r>
-      <w:r>
-        <w:t xml:space="preserve">de </w:t>
-      </w:r>
-      <w:r>
-        <w:t xml:space="preserve">tous âges et </w:t>
-      </w:r>
-      <w:r>
-        <w:t xml:space="preserve">de </w:t>
-      </w:r>
-      <w:r>
-        <w:t>niveaux confondus. Il offre une expérience accessible aux joueurs occasionnels comme aux compétiteurs.</w:t>
-      </w:r>
-    </w:p>
-    <w:p/>
-    <w:p>
-      <w:r>
+      <w:pPr>
+        <w:rPr>
+          <w:lang w:val="fr-CA"/>
+        </w:rPr>
+      </w:pPr>
+      <w:r>
+        <w:rPr>
+          <w:lang w:val="fr-CA"/>
+        </w:rPr>
+        <w:t>L’Attaque s'adresse aux amateurs de jeux de plateaux classiques, de tous âges et de niveaux confondus. Il offre une expérience accessible aux joueurs occasionnels comme aux compétiteurs.</w:t>
+      </w:r>
+    </w:p>
+    <w:p>
+      <w:pPr>
+        <w:rPr>
+          <w:lang w:val="fr-CA"/>
+        </w:rPr>
+      </w:pPr>
+    </w:p>
+    <w:p>
+      <w:pPr>
+        <w:rPr>
+          <w:lang w:val="fr-CA"/>
+        </w:rPr>
+      </w:pPr>
+      <w:r>
+        <w:rPr>
+          <w:lang w:val="fr-CA"/>
+        </w:rPr>
         <w:t xml:space="preserve">Les parties prenantes se divisent en </w:t>
       </w:r>
       <w:r>
+        <w:rPr>
+          <w:lang w:val="fr-CA"/>
+        </w:rPr>
         <w:t>trois</w:t>
       </w:r>
       <w:r>
+        <w:rPr>
+          <w:lang w:val="fr-CA"/>
+        </w:rPr>
         <w:t xml:space="preserve"> catégories : </w:t>
       </w:r>
     </w:p>
-    <w:p/>
+    <w:p>
+      <w:pPr>
+        <w:rPr>
+          <w:lang w:val="fr-CA"/>
+        </w:rPr>
+      </w:pPr>
+    </w:p>
     <w:p>
       <w:pPr>
         <w:pStyle w:val="Paragraphedeliste"/>
@@ -961,29 +1321,69 @@
           <w:ilvl w:val="0"/>
           <w:numId w:val="12"/>
         </w:numPr>
-      </w:pPr>
-      <w:r>
+        <w:rPr>
+          <w:lang w:val="fr-CA"/>
+        </w:rPr>
+      </w:pPr>
+      <w:r>
+        <w:rPr>
+          <w:lang w:val="fr-CA"/>
+        </w:rPr>
         <w:t>Utilisateurs finaux :</w:t>
       </w:r>
       <w:r>
+        <w:rPr>
+          <w:lang w:val="fr-CA"/>
+        </w:rPr>
         <w:t xml:space="preserve">  </w:t>
       </w:r>
       <w:r>
-        <w:t>Joueurs occasionnels et compétitifs (leaderboard)</w:t>
-      </w:r>
-      <w:r>
-        <w:t>:</w:t>
-      </w:r>
-      <w:r>
-        <w:t xml:space="preserve"> </w:t>
-      </w:r>
-      <w:r>
-        <w:t>Utilisent l’interface pour jouer, consulter le leaderboard, et sauvegarder leurs parties.</w:t>
+        <w:rPr>
+          <w:lang w:val="fr-CA"/>
+        </w:rPr>
+        <w:t>Joueurs occasionnels et compétitifs (</w:t>
+      </w:r>
+      <w:proofErr w:type="spellStart"/>
+      <w:r>
+        <w:rPr>
+          <w:lang w:val="fr-CA"/>
+        </w:rPr>
+        <w:t>leaderboard</w:t>
+      </w:r>
+      <w:proofErr w:type="spellEnd"/>
+      <w:r>
+        <w:rPr>
+          <w:lang w:val="fr-CA"/>
+        </w:rPr>
+        <w:t>)</w:t>
+      </w:r>
+      <w:r>
+        <w:rPr>
+          <w:lang w:val="fr-CA"/>
+        </w:rPr>
+        <w:t xml:space="preserve">: Utilisent l’interface pour jouer, consulter le </w:t>
+      </w:r>
+      <w:proofErr w:type="spellStart"/>
+      <w:r>
+        <w:rPr>
+          <w:lang w:val="fr-CA"/>
+        </w:rPr>
+        <w:t>leaderboard</w:t>
+      </w:r>
+      <w:proofErr w:type="spellEnd"/>
+      <w:r>
+        <w:rPr>
+          <w:lang w:val="fr-CA"/>
+        </w:rPr>
+        <w:t>, et sauvegarder leurs parties.</w:t>
       </w:r>
     </w:p>
     <w:p>
       <w:pPr>
         <w:pStyle w:val="Paragraphedeliste"/>
+        <w:rPr>
+          <w:lang w:val="fr-CA"/>
+        </w:rPr>
       </w:pPr>
     </w:p>
     <w:p>
@@ -993,21 +1393,30 @@
           <w:ilvl w:val="0"/>
           <w:numId w:val="12"/>
         </w:numPr>
-      </w:pPr>
-      <w:r>
+        <w:rPr>
+          <w:lang w:val="fr-CA"/>
+        </w:rPr>
+      </w:pPr>
+      <w:r>
+        <w:rPr>
+          <w:lang w:val="fr-CA"/>
+        </w:rPr>
         <w:t>Administrateur</w:t>
       </w:r>
       <w:r>
-        <w:t>:</w:t>
-      </w:r>
-      <w:r>
-        <w:t xml:space="preserve"> </w:t>
-      </w:r>
-      <w:r>
-        <w:t>Accès à un panneau d’administration pour gérer les scores et les comptes.</w:t>
-      </w:r>
-    </w:p>
-    <w:p/>
+        <w:rPr>
+          <w:lang w:val="fr-CA"/>
+        </w:rPr>
+        <w:t>: Accès à un panneau d’administration pour gérer les scores et les comptes.</w:t>
+      </w:r>
+    </w:p>
+    <w:p>
+      <w:pPr>
+        <w:rPr>
+          <w:lang w:val="fr-CA"/>
+        </w:rPr>
+      </w:pPr>
+    </w:p>
     <w:p>
       <w:pPr>
         <w:pStyle w:val="Paragraphedeliste"/>
@@ -1015,93 +1424,180 @@
           <w:ilvl w:val="0"/>
           <w:numId w:val="12"/>
         </w:numPr>
-      </w:pPr>
-      <w:r>
+        <w:rPr>
+          <w:lang w:val="fr-CA"/>
+        </w:rPr>
+      </w:pPr>
+      <w:r>
+        <w:rPr>
+          <w:lang w:val="fr-CA"/>
+        </w:rPr>
         <w:t>Équipe technique</w:t>
       </w:r>
       <w:r>
-        <w:t xml:space="preserve"> (</w:t>
-      </w:r>
-      <w:r>
-        <w:t>l'équipe de développement,</w:t>
-      </w:r>
-      <w:r>
-        <w:t xml:space="preserve"> t</w:t>
-      </w:r>
-      <w:r>
+        <w:rPr>
+          <w:lang w:val="fr-CA"/>
+        </w:rPr>
+        <w:t xml:space="preserve"> (l'équipe de développement, t</w:t>
+      </w:r>
+      <w:r>
+        <w:rPr>
+          <w:lang w:val="fr-CA"/>
+        </w:rPr>
         <w:t>esteurs</w:t>
       </w:r>
       <w:r>
+        <w:rPr>
+          <w:lang w:val="fr-CA"/>
+        </w:rPr>
         <w:t>, c</w:t>
       </w:r>
       <w:r>
+        <w:rPr>
+          <w:lang w:val="fr-CA"/>
+        </w:rPr>
         <w:t>ontributeurs futurs (évolution</w:t>
       </w:r>
       <w:r>
-        <w:t xml:space="preserve"> furture du projet</w:t>
-      </w:r>
-      <w:r>
+        <w:rPr>
+          <w:lang w:val="fr-CA"/>
+        </w:rPr>
+        <w:t xml:space="preserve"> future du projet</w:t>
+      </w:r>
+      <w:r>
+        <w:rPr>
+          <w:lang w:val="fr-CA"/>
+        </w:rPr>
         <w:t>)</w:t>
       </w:r>
       <w:r>
-        <w:t>:</w:t>
-      </w:r>
-      <w:r>
-        <w:t xml:space="preserve"> </w:t>
-      </w:r>
-      <w:r>
-        <w:t>Travaille</w:t>
-      </w:r>
-      <w:r>
-        <w:t>nt</w:t>
-      </w:r>
-      <w:r>
-        <w:t xml:space="preserve"> sur le dépôt Git pour améliorer le </w:t>
-      </w:r>
-      <w:r>
-        <w:t>programme</w:t>
-      </w:r>
-      <w:r>
-        <w:t>, l’IA et corriger les bugs.</w:t>
-      </w:r>
-    </w:p>
-    <w:p/>
-    <w:p/>
-    <w:p/>
-    <w:p/>
-    <w:p/>
-    <w:p/>
-    <w:p/>
-    <w:p/>
-    <w:p/>
-    <w:p/>
-    <w:p/>
-    <w:p/>
-    <w:p/>
-    <w:p/>
-    <w:p/>
+        <w:rPr>
+          <w:lang w:val="fr-CA"/>
+        </w:rPr>
+        <w:t>: Travaillent sur le dépôt Git pour améliorer le programme, l’IA et corriger les bugs.</w:t>
+      </w:r>
+    </w:p>
+    <w:p>
+      <w:pPr>
+        <w:rPr>
+          <w:lang w:val="fr-CA"/>
+        </w:rPr>
+      </w:pPr>
+    </w:p>
+    <w:p>
+      <w:pPr>
+        <w:rPr>
+          <w:lang w:val="fr-CA"/>
+        </w:rPr>
+      </w:pPr>
+    </w:p>
+    <w:p>
+      <w:pPr>
+        <w:rPr>
+          <w:lang w:val="fr-CA"/>
+        </w:rPr>
+      </w:pPr>
+    </w:p>
+    <w:p>
+      <w:pPr>
+        <w:rPr>
+          <w:lang w:val="fr-CA"/>
+        </w:rPr>
+      </w:pPr>
+    </w:p>
+    <w:p>
+      <w:pPr>
+        <w:rPr>
+          <w:lang w:val="fr-CA"/>
+        </w:rPr>
+      </w:pPr>
+    </w:p>
+    <w:p>
+      <w:pPr>
+        <w:rPr>
+          <w:lang w:val="fr-CA"/>
+        </w:rPr>
+      </w:pPr>
+    </w:p>
+    <w:p>
+      <w:pPr>
+        <w:rPr>
+          <w:lang w:val="fr-CA"/>
+        </w:rPr>
+      </w:pPr>
+    </w:p>
+    <w:p>
+      <w:pPr>
+        <w:rPr>
+          <w:lang w:val="fr-CA"/>
+        </w:rPr>
+      </w:pPr>
+    </w:p>
+    <w:p>
+      <w:pPr>
+        <w:rPr>
+          <w:lang w:val="fr-CA"/>
+        </w:rPr>
+      </w:pPr>
+    </w:p>
+    <w:p>
+      <w:pPr>
+        <w:rPr>
+          <w:lang w:val="fr-CA"/>
+        </w:rPr>
+      </w:pPr>
+    </w:p>
+    <w:p>
+      <w:pPr>
+        <w:rPr>
+          <w:lang w:val="fr-CA"/>
+        </w:rPr>
+      </w:pPr>
+    </w:p>
+    <w:p>
+      <w:pPr>
+        <w:rPr>
+          <w:lang w:val="fr-CA"/>
+        </w:rPr>
+      </w:pPr>
+    </w:p>
+    <w:p>
+      <w:pPr>
+        <w:rPr>
+          <w:lang w:val="fr-CA"/>
+        </w:rPr>
+      </w:pPr>
+    </w:p>
+    <w:p>
+      <w:pPr>
+        <w:rPr>
+          <w:lang w:val="fr-CA"/>
+        </w:rPr>
+      </w:pPr>
+    </w:p>
+    <w:p>
+      <w:pPr>
+        <w:rPr>
+          <w:lang w:val="fr-CA"/>
+        </w:rPr>
+      </w:pPr>
+    </w:p>
     <w:p>
       <w:pPr>
         <w:pStyle w:val="Titre2"/>
         <w:rPr>
           <w:rStyle w:val="lev"/>
           <w:u w:val="single"/>
+          <w:lang w:val="fr-CA"/>
         </w:rPr>
       </w:pPr>
       <w:r>
         <w:rPr>
           <w:rStyle w:val="lev"/>
           <w:u w:val="single"/>
-        </w:rPr>
-        <w:lastRenderedPageBreak/>
-        <w:t>E</w:t>
-      </w:r>
-      <w:r>
-        <w:rPr>
-          <w:rStyle w:val="lev"/>
-          <w:u w:val="single"/>
-        </w:rPr>
-        <w:t>xigences du client</w:t>
+          <w:lang w:val="fr-CA"/>
+        </w:rPr>
+        <w:t>Exigences du client</w:t>
       </w:r>
     </w:p>
     <w:p>
@@ -1132,20 +1628,9 @@
       <w:r>
         <w:rPr>
           <w:rStyle w:val="lev"/>
-        </w:rPr>
-        <w:t xml:space="preserve">Exigence </w:t>
-      </w:r>
-      <w:r>
-        <w:rPr>
-          <w:rStyle w:val="lev"/>
-        </w:rPr>
-        <w:t>1</w:t>
-      </w:r>
-      <w:r>
-        <w:rPr>
-          <w:rStyle w:val="lev"/>
-        </w:rPr>
-        <w:t xml:space="preserve"> : </w:t>
+          <w:lang w:val="fr-CA"/>
+        </w:rPr>
+        <w:t xml:space="preserve">Exigence 1 : </w:t>
       </w:r>
       <w:r>
         <w:rPr>
@@ -1161,15 +1646,35 @@
           <w:i/>
           <w:lang w:val="fr-CA"/>
         </w:rPr>
-        <w:t>classement</w:t>
-      </w:r>
+        <w:t xml:space="preserve">classement </w:t>
+      </w:r>
+      <w:proofErr w:type="gramStart"/>
       <w:r>
         <w:rPr>
           <w:b/>
           <w:i/>
           <w:lang w:val="fr-CA"/>
         </w:rPr>
-        <w:t xml:space="preserve"> ( Learderboard)</w:t>
+        <w:t xml:space="preserve">( </w:t>
+      </w:r>
+      <w:proofErr w:type="spellStart"/>
+      <w:r>
+        <w:rPr>
+          <w:b/>
+          <w:i/>
+          <w:lang w:val="fr-CA"/>
+        </w:rPr>
+        <w:t>Leaderboard</w:t>
+      </w:r>
+      <w:proofErr w:type="spellEnd"/>
+      <w:proofErr w:type="gramEnd"/>
+      <w:r>
+        <w:rPr>
+          <w:b/>
+          <w:i/>
+          <w:lang w:val="fr-CA"/>
+        </w:rPr>
+        <w:t>)</w:t>
       </w:r>
     </w:p>
     <w:p>
@@ -1177,25 +1682,55 @@
         <w:rPr>
           <w:b/>
           <w:bCs/>
-        </w:rPr>
-      </w:pPr>
-    </w:p>
-    <w:p>
+          <w:lang w:val="fr-CA"/>
+        </w:rPr>
+      </w:pPr>
+    </w:p>
+    <w:p>
+      <w:pPr>
+        <w:rPr>
+          <w:lang w:val="fr-CA"/>
+        </w:rPr>
+      </w:pPr>
       <w:r>
         <w:rPr>
           <w:b/>
           <w:bCs/>
+          <w:lang w:val="fr-CA"/>
         </w:rPr>
         <w:t>Description:</w:t>
       </w:r>
       <w:r>
-        <w:t xml:space="preserve"> Un tableau affiche les meilleurs joueurs selon leur ratio victoires/défaites et points de performance cumulés, valables pour les parties solo </w:t>
-      </w:r>
-      <w:r>
-        <w:t>et</w:t>
-      </w:r>
-      <w:r>
-        <w:t xml:space="preserve"> multijoueurs.</w:t>
+        <w:rPr>
+          <w:lang w:val="fr-CA"/>
+        </w:rPr>
+        <w:t xml:space="preserve"> Un tableau affiche les meilleurs joueurs selon leur ratio victoires/défaites et points de performance cumulés, valables pour les parties solo</w:t>
+      </w:r>
+      <w:r>
+        <w:rPr>
+          <w:lang w:val="fr-CA"/>
+        </w:rPr>
+        <w:t>s</w:t>
+      </w:r>
+      <w:r>
+        <w:rPr>
+          <w:lang w:val="fr-CA"/>
+        </w:rPr>
+        <w:t xml:space="preserve"> et </w:t>
+      </w:r>
+      <w:proofErr w:type="spellStart"/>
+      <w:r>
+        <w:rPr>
+          <w:lang w:val="fr-CA"/>
+        </w:rPr>
+        <w:t>multijoueurs</w:t>
+      </w:r>
+      <w:proofErr w:type="spellEnd"/>
+      <w:r>
+        <w:rPr>
+          <w:lang w:val="fr-CA"/>
+        </w:rPr>
+        <w:t>.</w:t>
       </w:r>
     </w:p>
     <w:p>
@@ -1203,54 +1738,114 @@
         <w:rPr>
           <w:b/>
           <w:bCs/>
-        </w:rPr>
-      </w:pPr>
-    </w:p>
-    <w:p>
+          <w:lang w:val="fr-CA"/>
+        </w:rPr>
+      </w:pPr>
+    </w:p>
+    <w:p>
+      <w:pPr>
+        <w:rPr>
+          <w:lang w:val="fr-CA"/>
+        </w:rPr>
+      </w:pPr>
       <w:r>
         <w:rPr>
           <w:b/>
           <w:bCs/>
+          <w:lang w:val="fr-CA"/>
         </w:rPr>
         <w:t>Utilisateurs concernés :</w:t>
       </w:r>
       <w:r>
+        <w:rPr>
+          <w:lang w:val="fr-CA"/>
+        </w:rPr>
         <w:t xml:space="preserve"> Joueurs compétitifs, Administrateur</w:t>
       </w:r>
-    </w:p>
-    <w:p/>
-    <w:p>
+      <w:r>
+        <w:rPr>
+          <w:lang w:val="fr-CA"/>
+        </w:rPr>
+        <w:t>s</w:t>
+      </w:r>
+    </w:p>
+    <w:p>
+      <w:pPr>
+        <w:rPr>
+          <w:lang w:val="fr-CA"/>
+        </w:rPr>
+      </w:pPr>
+    </w:p>
+    <w:p>
+      <w:pPr>
+        <w:rPr>
+          <w:lang w:val="fr-CA"/>
+        </w:rPr>
+      </w:pPr>
       <w:r>
         <w:rPr>
           <w:b/>
           <w:bCs/>
+          <w:lang w:val="fr-CA"/>
         </w:rPr>
         <w:t>Importance:</w:t>
       </w:r>
       <w:r>
+        <w:rPr>
+          <w:lang w:val="fr-CA"/>
+        </w:rPr>
         <w:t> Souhaitable</w:t>
       </w:r>
     </w:p>
-    <w:p/>
-    <w:p>
+    <w:p>
+      <w:pPr>
+        <w:rPr>
+          <w:lang w:val="fr-CA"/>
+        </w:rPr>
+      </w:pPr>
+    </w:p>
+    <w:p>
+      <w:pPr>
+        <w:rPr>
+          <w:lang w:val="fr-CA"/>
+        </w:rPr>
+      </w:pPr>
       <w:r>
         <w:rPr>
           <w:b/>
           <w:bCs/>
+          <w:lang w:val="fr-CA"/>
         </w:rPr>
         <w:t>Contrainte du client:</w:t>
       </w:r>
       <w:r>
-        <w:t xml:space="preserve"> </w:t>
-      </w:r>
-      <w:r>
-        <w:t xml:space="preserve">Seules </w:t>
-      </w:r>
-      <w:r>
-        <w:t>les parties terminées (solo et multijoueurs) comptent pour le classement.</w:t>
-      </w:r>
-    </w:p>
-    <w:p/>
+        <w:rPr>
+          <w:lang w:val="fr-CA"/>
+        </w:rPr>
+        <w:t xml:space="preserve"> Seules les parties terminées (solo et </w:t>
+      </w:r>
+      <w:proofErr w:type="spellStart"/>
+      <w:r>
+        <w:rPr>
+          <w:lang w:val="fr-CA"/>
+        </w:rPr>
+        <w:t>multijoueurs</w:t>
+      </w:r>
+      <w:proofErr w:type="spellEnd"/>
+      <w:r>
+        <w:rPr>
+          <w:lang w:val="fr-CA"/>
+        </w:rPr>
+        <w:t>) comptent pour le classement.</w:t>
+      </w:r>
+    </w:p>
+    <w:p>
+      <w:pPr>
+        <w:rPr>
+          <w:lang w:val="fr-CA"/>
+        </w:rPr>
+      </w:pPr>
+    </w:p>
     <w:p>
       <w:pPr>
         <w:pBdr>
@@ -1263,41 +1858,29 @@
         <w:jc w:val="both"/>
         <w:rPr>
           <w:rFonts w:ascii="Segoe UI" w:hAnsi="Segoe UI" w:cs="Segoe UI"/>
+          <w:lang w:val="fr-CA"/>
         </w:rPr>
       </w:pPr>
       <w:r>
         <w:rPr>
           <w:b/>
           <w:bCs/>
+          <w:lang w:val="fr-CA"/>
         </w:rPr>
         <w:t>Description technique de haut niveau:</w:t>
       </w:r>
       <w:r>
         <w:rPr>
           <w:rFonts w:ascii="Segoe UI" w:hAnsi="Segoe UI" w:cs="Segoe UI"/>
+          <w:lang w:val="fr-CA"/>
         </w:rPr>
         <w:t xml:space="preserve"> </w:t>
       </w:r>
       <w:r>
-        <w:t>Base de données regroupant les résultats d</w:t>
-      </w:r>
-      <w:r>
-        <w:t>u</w:t>
-      </w:r>
-      <w:r>
-        <w:t xml:space="preserve"> jeu, avec </w:t>
-      </w:r>
-      <w:r>
-        <w:t xml:space="preserve">une </w:t>
-      </w:r>
-      <w:r>
-        <w:t>interface</w:t>
-      </w:r>
-      <w:r>
-        <w:t xml:space="preserve"> </w:t>
-      </w:r>
-      <w:r>
-        <w:t>classant automatiquement les joueurs du plus performant au moins performant.</w:t>
+        <w:rPr>
+          <w:lang w:val="fr-CA"/>
+        </w:rPr>
+        <w:t>Base de données regroupant les résultats du jeu, avec une interface classant automatiquement les joueurs du plus performant au moins performant.</w:t>
       </w:r>
     </w:p>
     <w:p>
@@ -1311,6 +1894,7 @@
         </w:pBdr>
         <w:rPr>
           <w:rFonts w:ascii="Segoe UI" w:hAnsi="Segoe UI" w:cs="Segoe UI"/>
+          <w:lang w:val="fr-CA"/>
         </w:rPr>
       </w:pPr>
     </w:p>
@@ -1333,18 +1917,33 @@
         <w:rPr>
           <w:b/>
           <w:bCs/>
-        </w:rPr>
-        <w:t>Contraintes de mise en œuvre</w:t>
-      </w:r>
-      <w:r>
-        <w:rPr>
-          <w:b/>
-          <w:bCs/>
-        </w:rPr>
-        <w:t xml:space="preserve">: </w:t>
-      </w:r>
-      <w:r>
-        <w:t>L'accès à la base de données doit impérativement être sécurisé par une authentification obligatoire et protégé contre les injections SQL.</w:t>
+          <w:lang w:val="fr-CA"/>
+        </w:rPr>
+        <w:t xml:space="preserve">Contraintes de mise en œuvre: </w:t>
+      </w:r>
+      <w:r>
+        <w:rPr>
+          <w:lang w:val="fr-CA"/>
+        </w:rPr>
+        <w:t>L'accès à la base de données doit impérativement être sécurisé par une authentification obligatoire et protégé</w:t>
+      </w:r>
+      <w:r>
+        <w:rPr>
+          <w:lang w:val="fr-CA"/>
+        </w:rPr>
+        <w:t>e</w:t>
+      </w:r>
+      <w:r>
+        <w:rPr>
+          <w:lang w:val="fr-CA"/>
+        </w:rPr>
+        <w:t xml:space="preserve"> contre les injections SQL.</w:t>
+      </w:r>
+      <w:r>
+        <w:rPr>
+          <w:lang w:val="fr-CA"/>
+        </w:rPr>
+        <w:t xml:space="preserve"> La base de données sera accessible uniquement par les développeurs et les administrateurs.</w:t>
       </w:r>
     </w:p>
     <w:p>
@@ -1392,11 +1991,13 @@
         <w:pStyle w:val="Titre4"/>
         <w:rPr>
           <w:rStyle w:val="lev"/>
+          <w:lang w:val="fr-CA"/>
         </w:rPr>
       </w:pPr>
       <w:r>
         <w:rPr>
           <w:rStyle w:val="lev"/>
+          <w:lang w:val="fr-CA"/>
         </w:rPr>
         <w:t xml:space="preserve">Exigence 2 : Sauvegarde et Restauration </w:t>
       </w:r>
@@ -1406,97 +2007,151 @@
         <w:rPr>
           <w:b/>
           <w:bCs/>
-        </w:rPr>
-      </w:pPr>
-    </w:p>
-    <w:p>
+          <w:lang w:val="fr-CA"/>
+        </w:rPr>
+      </w:pPr>
+    </w:p>
+    <w:p>
+      <w:pPr>
+        <w:rPr>
+          <w:lang w:val="fr-CA"/>
+        </w:rPr>
+      </w:pPr>
       <w:r>
         <w:rPr>
           <w:b/>
           <w:bCs/>
+          <w:lang w:val="fr-CA"/>
         </w:rPr>
         <w:t>Description:</w:t>
       </w:r>
       <w:r>
+        <w:rPr>
+          <w:lang w:val="fr-CA"/>
+        </w:rPr>
         <w:t xml:space="preserve"> </w:t>
       </w:r>
       <w:r>
         <w:rPr>
           <w:rStyle w:val="citation-786"/>
-        </w:rPr>
-        <w:t xml:space="preserve">Permet à l'utilisateur de sauvegarder sa progression lors d'une partie contre l'intelligence artificielle pour la reprendre ultérieurement sans perdre ses statistiques ou </w:t>
-      </w:r>
-      <w:r>
+          <w:lang w:val="fr-CA"/>
+        </w:rPr>
+        <w:t>Permet à l'utilisateur de sauvegarder sa progression lors d'une partie contre l'intelligence artificielle pour la reprendre ultérieurement sans perdre ses statistiques ou son jeu</w:t>
+      </w:r>
+      <w:r>
+        <w:rPr>
+          <w:lang w:val="fr-CA"/>
+        </w:rPr>
+        <w:t>.</w:t>
+      </w:r>
+    </w:p>
+    <w:p>
+      <w:pPr>
+        <w:rPr>
+          <w:b/>
+          <w:bCs/>
+          <w:lang w:val="fr-CA"/>
+        </w:rPr>
+      </w:pPr>
+    </w:p>
+    <w:p>
+      <w:pPr>
+        <w:rPr>
+          <w:lang w:val="fr-CA"/>
+        </w:rPr>
+      </w:pPr>
+      <w:r>
+        <w:rPr>
+          <w:b/>
+          <w:bCs/>
+          <w:lang w:val="fr-CA"/>
+        </w:rPr>
+        <w:t>Utilisateurs concernés :</w:t>
+      </w:r>
+      <w:r>
+        <w:rPr>
+          <w:lang w:val="fr-CA"/>
+        </w:rPr>
+        <w:t xml:space="preserve"> Joueurs, Administrateur</w:t>
+      </w:r>
+    </w:p>
+    <w:p>
+      <w:pPr>
+        <w:rPr>
+          <w:lang w:val="fr-CA"/>
+        </w:rPr>
+      </w:pPr>
+    </w:p>
+    <w:p>
+      <w:pPr>
+        <w:rPr>
+          <w:lang w:val="fr-CA"/>
+        </w:rPr>
+      </w:pPr>
+      <w:r>
+        <w:rPr>
+          <w:b/>
+          <w:bCs/>
+          <w:lang w:val="fr-CA"/>
+        </w:rPr>
+        <w:t>Importance:</w:t>
+      </w:r>
+      <w:r>
+        <w:rPr>
+          <w:lang w:val="fr-CA"/>
+        </w:rPr>
+        <w:t> </w:t>
+      </w:r>
+      <w:r>
+        <w:rPr>
+          <w:lang w:val="fr-CA"/>
+        </w:rPr>
+        <w:t>Indispensable</w:t>
+      </w:r>
+    </w:p>
+    <w:p>
+      <w:pPr>
+        <w:rPr>
+          <w:lang w:val="fr-CA"/>
+        </w:rPr>
+      </w:pPr>
+    </w:p>
+    <w:p>
+      <w:pPr>
         <w:rPr>
           <w:rStyle w:val="citation-786"/>
-        </w:rPr>
-        <w:t>son jeu</w:t>
-      </w:r>
-      <w:r>
-        <w:t>.</w:t>
-      </w:r>
-    </w:p>
-    <w:p>
-      <w:pPr>
+          <w:lang w:val="fr-CA"/>
+        </w:rPr>
+      </w:pPr>
+      <w:r>
         <w:rPr>
           <w:b/>
           <w:bCs/>
-        </w:rPr>
-      </w:pPr>
-    </w:p>
-    <w:p>
-      <w:r>
-        <w:rPr>
-          <w:b/>
-          <w:bCs/>
-        </w:rPr>
-        <w:t>Utilisateurs concernés :</w:t>
-      </w:r>
-      <w:r>
-        <w:t xml:space="preserve"> Joueurs , Administrateur</w:t>
-      </w:r>
-    </w:p>
-    <w:p/>
-    <w:p>
-      <w:r>
-        <w:rPr>
-          <w:b/>
-          <w:bCs/>
-        </w:rPr>
-        <w:t>Importance:</w:t>
-      </w:r>
-      <w:r>
-        <w:t> </w:t>
-      </w:r>
-      <w:r>
-        <w:t>Indispensable</w:t>
-      </w:r>
-    </w:p>
-    <w:p/>
-    <w:p>
-      <w:pPr>
+          <w:lang w:val="fr-CA"/>
+        </w:rPr>
+        <w:t>Contrainte du client:</w:t>
+      </w:r>
+      <w:r>
+        <w:rPr>
+          <w:lang w:val="fr-CA"/>
+        </w:rPr>
+        <w:t xml:space="preserve"> </w:t>
+      </w:r>
+      <w:r>
         <w:rPr>
           <w:rStyle w:val="citation-786"/>
-        </w:rPr>
-      </w:pPr>
-      <w:r>
-        <w:rPr>
-          <w:b/>
-          <w:bCs/>
-        </w:rPr>
-        <w:t>Contrainte du client:</w:t>
-      </w:r>
-      <w:r>
-        <w:t xml:space="preserve"> </w:t>
-      </w:r>
-      <w:r>
-        <w:rPr>
-          <w:rStyle w:val="citation-786"/>
+          <w:lang w:val="fr-CA"/>
         </w:rPr>
         <w:t>La restauration doit être possible à tout moment, mais limitée à une seule sauvegarde active par utilisateur pour optimiser l'espace disque.</w:t>
       </w:r>
     </w:p>
-    <w:p/>
+    <w:p>
+      <w:pPr>
+        <w:rPr>
+          <w:lang w:val="fr-CA"/>
+        </w:rPr>
+      </w:pPr>
+    </w:p>
     <w:p>
       <w:pPr>
         <w:pBdr>
@@ -1507,40 +2162,54 @@
           <w:between w:val="nil"/>
         </w:pBdr>
         <w:jc w:val="both"/>
+        <w:rPr>
+          <w:lang w:val="fr-CA"/>
+        </w:rPr>
       </w:pPr>
       <w:r>
         <w:rPr>
           <w:b/>
           <w:bCs/>
+          <w:lang w:val="fr-CA"/>
         </w:rPr>
         <w:t>Description technique de haut niveau:</w:t>
       </w:r>
       <w:r>
         <w:rPr>
           <w:rFonts w:ascii="Segoe UI" w:hAnsi="Segoe UI" w:cs="Segoe UI"/>
+          <w:lang w:val="fr-CA"/>
         </w:rPr>
         <w:t xml:space="preserve"> </w:t>
       </w:r>
       <w:r>
-        <w:t>Un bouton "Sa</w:t>
-      </w:r>
-      <w:r>
-        <w:t>ve</w:t>
-      </w:r>
-      <w:r>
-        <w:t>" sérialise l'état actuel de la grille (positions des pièces, tour de jeu</w:t>
-      </w:r>
-      <w:r>
-        <w:t>,score actuel</w:t>
-      </w:r>
-      <w:r>
-        <w:t>) et l'envoie vers la base de données. Au chargement, une fonction de restauration re</w:t>
-      </w:r>
-      <w:r>
-        <w:t>staure</w:t>
-      </w:r>
-      <w:r>
-        <w:t xml:space="preserve"> l'interface à partir de ces données.</w:t>
+        <w:rPr>
+          <w:lang w:val="fr-CA"/>
+        </w:rPr>
+        <w:t>Un bouton "Save" sérialise l'état actuel de la grille (positions des pièces, tour de jeu,</w:t>
+      </w:r>
+      <w:r>
+        <w:rPr>
+          <w:lang w:val="fr-CA"/>
+        </w:rPr>
+        <w:t xml:space="preserve"> </w:t>
+      </w:r>
+      <w:r>
+        <w:rPr>
+          <w:lang w:val="fr-CA"/>
+        </w:rPr>
+        <w:t>score actuel) et l'envoie vers la base de données</w:t>
+      </w:r>
+      <w:r>
+        <w:rPr>
+          <w:lang w:val="fr-CA"/>
+        </w:rPr>
+        <w:t xml:space="preserve"> sous la forme d’un fichier JSON</w:t>
+      </w:r>
+      <w:r>
+        <w:rPr>
+          <w:lang w:val="fr-CA"/>
+        </w:rPr>
+        <w:t>. Au chargement, une fonction de restauration restaure l'interface à partir de ces données.</w:t>
       </w:r>
     </w:p>
     <w:p>
@@ -1555,6 +2224,7 @@
         <w:jc w:val="both"/>
         <w:rPr>
           <w:rFonts w:ascii="Segoe UI" w:hAnsi="Segoe UI" w:cs="Segoe UI"/>
+          <w:lang w:val="fr-CA"/>
         </w:rPr>
       </w:pPr>
     </w:p>
@@ -1577,19 +2247,56 @@
         <w:rPr>
           <w:b/>
           <w:bCs/>
-        </w:rPr>
-        <w:t>Contraintes de mise en œuvre</w:t>
-      </w:r>
-      <w:r>
-        <w:rPr>
-          <w:b/>
-          <w:bCs/>
-        </w:rPr>
-        <w:t xml:space="preserve">: </w:t>
-      </w:r>
-      <w:r>
-        <w:t>L'accès à la base de données doit impérativement être sécurisé par une authentification obligatoire et protégé contre les injections SQL.</w:t>
-      </w:r>
+          <w:lang w:val="fr-CA"/>
+        </w:rPr>
+        <w:t xml:space="preserve">Contraintes de mise en œuvre: </w:t>
+      </w:r>
+      <w:r>
+        <w:rPr>
+          <w:lang w:val="fr-CA"/>
+        </w:rPr>
+        <w:t>L'accès à la base de données doit impérativement être sécurisé par une authentification obligatoire et protégé</w:t>
+      </w:r>
+      <w:r>
+        <w:rPr>
+          <w:lang w:val="fr-CA"/>
+        </w:rPr>
+        <w:t>e</w:t>
+      </w:r>
+      <w:r>
+        <w:rPr>
+          <w:lang w:val="fr-CA"/>
+        </w:rPr>
+        <w:t xml:space="preserve"> contre les injections SQL.</w:t>
+      </w:r>
+      <w:r>
+        <w:rPr>
+          <w:lang w:val="fr-CA"/>
+        </w:rPr>
+        <w:t xml:space="preserve"> </w:t>
+      </w:r>
+      <w:r>
+        <w:rPr>
+          <w:lang w:val="fr-CA"/>
+        </w:rPr>
+        <w:t>La base de données sera accessible uniquement par les développeurs et les administrateurs.</w:t>
+      </w:r>
+    </w:p>
+    <w:p>
+      <w:pPr>
+        <w:pBdr>
+          <w:top w:val="nil"/>
+          <w:left w:val="nil"/>
+          <w:bottom w:val="nil"/>
+          <w:right w:val="nil"/>
+          <w:between w:val="nil"/>
+        </w:pBdr>
+        <w:rPr>
+          <w:b/>
+          <w:i/>
+          <w:lang w:val="fr-CA"/>
+        </w:rPr>
+      </w:pPr>
     </w:p>
     <w:p>
       <w:pPr>
@@ -1599,6 +2306,7 @@
           <w:bCs w:val="0"/>
           <w:i/>
           <w:iCs/>
+          <w:lang w:val="fr-CA"/>
         </w:rPr>
       </w:pPr>
       <w:r>
@@ -1607,27 +2315,9 @@
           <w:bCs w:val="0"/>
           <w:i/>
           <w:iCs/>
-        </w:rPr>
-        <w:lastRenderedPageBreak/>
-        <w:t xml:space="preserve">Exigence  </w:t>
-      </w:r>
-      <w:r>
-        <w:rPr>
-          <w:rStyle w:val="lev"/>
-          <w:bCs w:val="0"/>
-          <w:i/>
-          <w:iCs/>
-        </w:rPr>
-        <w:t>3</w:t>
-      </w:r>
-      <w:r>
-        <w:rPr>
-          <w:rStyle w:val="lev"/>
-          <w:bCs w:val="0"/>
-          <w:i/>
-          <w:iCs/>
-        </w:rPr>
-        <w:t>: Système de Combat Automatisé</w:t>
+          <w:lang w:val="fr-CA"/>
+        </w:rPr>
+        <w:t>Exigence 3: Système de Combat Automatisé</w:t>
       </w:r>
     </w:p>
     <w:p>
@@ -1641,35 +2331,47 @@
       <w:pPr>
         <w:rPr>
           <w:rStyle w:val="citation-868"/>
+          <w:lang w:val="fr-CA"/>
         </w:rPr>
       </w:pPr>
       <w:r>
         <w:rPr>
           <w:b/>
           <w:bCs/>
+          <w:lang w:val="fr-CA"/>
         </w:rPr>
         <w:t>Description:</w:t>
       </w:r>
       <w:r>
+        <w:rPr>
+          <w:lang w:val="fr-CA"/>
+        </w:rPr>
         <w:t xml:space="preserve"> </w:t>
       </w:r>
       <w:r>
         <w:rPr>
           <w:rStyle w:val="citation-868"/>
+          <w:lang w:val="fr-CA"/>
         </w:rPr>
         <w:tab/>
       </w:r>
       <w:r>
-        <w:t xml:space="preserve">Lorsqu’une pièce </w:t>
-      </w:r>
-      <w:r>
-        <w:t xml:space="preserve">est déplacé sur </w:t>
-      </w:r>
-      <w:r>
-        <w:t xml:space="preserve"> une case occupée par une pièce adverse, le programme compare automatiquement le grade des pièces pour déterminer le vainqueur selon </w:t>
-      </w:r>
-      <w:r>
-        <w:t>les règles de jeu.</w:t>
+        <w:rPr>
+          <w:lang w:val="fr-CA"/>
+        </w:rPr>
+        <w:t>Lorsqu’une pièce est déplacé</w:t>
+      </w:r>
+      <w:r>
+        <w:rPr>
+          <w:lang w:val="fr-CA"/>
+        </w:rPr>
+        <w:t>e</w:t>
+      </w:r>
+      <w:r>
+        <w:rPr>
+          <w:lang w:val="fr-CA"/>
+        </w:rPr>
+        <w:t xml:space="preserve"> sur une case occupée par une pièce adverse, le programme compare automatiquement le grade des pièces pour déterminer le vainqueur selon les règles de jeu.</w:t>
       </w:r>
     </w:p>
     <w:p>
@@ -1677,68 +2379,114 @@
         <w:rPr>
           <w:b/>
           <w:bCs/>
-        </w:rPr>
-      </w:pPr>
-    </w:p>
-    <w:p>
+          <w:lang w:val="fr-CA"/>
+        </w:rPr>
+      </w:pPr>
+    </w:p>
+    <w:p>
+      <w:pPr>
+        <w:rPr>
+          <w:lang w:val="fr-CA"/>
+        </w:rPr>
+      </w:pPr>
       <w:r>
         <w:rPr>
           <w:b/>
           <w:bCs/>
+          <w:lang w:val="fr-CA"/>
         </w:rPr>
         <w:t>Utilisateurs concernés :</w:t>
       </w:r>
       <w:r>
+        <w:rPr>
+          <w:lang w:val="fr-CA"/>
+        </w:rPr>
+        <w:t xml:space="preserve"> Joueurs, Équipe technique </w:t>
+      </w:r>
+    </w:p>
+    <w:p>
+      <w:pPr>
+        <w:rPr>
+          <w:lang w:val="fr-CA"/>
+        </w:rPr>
+      </w:pPr>
+    </w:p>
+    <w:p>
+      <w:pPr>
+        <w:rPr>
+          <w:lang w:val="fr-CA"/>
+        </w:rPr>
+      </w:pPr>
+      <w:r>
+        <w:rPr>
+          <w:b/>
+          <w:bCs/>
+          <w:lang w:val="fr-CA"/>
+        </w:rPr>
+        <w:t>Importance:</w:t>
+      </w:r>
+      <w:r>
+        <w:rPr>
+          <w:lang w:val="fr-CA"/>
+        </w:rPr>
+        <w:t> Indispensable</w:t>
+      </w:r>
+    </w:p>
+    <w:p>
+      <w:pPr>
+        <w:rPr>
+          <w:lang w:val="fr-CA"/>
+        </w:rPr>
+      </w:pPr>
+    </w:p>
+    <w:p>
+      <w:pPr>
+        <w:rPr>
+          <w:rStyle w:val="citation-786"/>
+          <w:lang w:val="fr-CA"/>
+        </w:rPr>
+      </w:pPr>
+      <w:r>
+        <w:rPr>
+          <w:b/>
+          <w:bCs/>
+          <w:lang w:val="fr-CA"/>
+        </w:rPr>
+        <w:t>Contrainte du client:</w:t>
+      </w:r>
+      <w:r>
+        <w:rPr>
+          <w:lang w:val="fr-CA"/>
+        </w:rPr>
         <w:t xml:space="preserve"> </w:t>
       </w:r>
       <w:r>
-        <w:t xml:space="preserve">Joueurs, Équipe technique </w:t>
-      </w:r>
-    </w:p>
-    <w:p/>
-    <w:p>
-      <w:r>
-        <w:rPr>
-          <w:b/>
-          <w:bCs/>
-        </w:rPr>
-        <w:t>Importance:</w:t>
-      </w:r>
-      <w:r>
-        <w:t> </w:t>
-      </w:r>
-      <w:r>
-        <w:t>Indispensable</w:t>
-      </w:r>
-    </w:p>
-    <w:p/>
-    <w:p>
-      <w:pPr>
         <w:rPr>
           <w:rStyle w:val="citation-786"/>
-        </w:rPr>
-      </w:pPr>
-      <w:r>
-        <w:rPr>
-          <w:b/>
-          <w:bCs/>
-        </w:rPr>
-        <w:t>Contrainte du client:</w:t>
-      </w:r>
-      <w:r>
+          <w:lang w:val="fr-CA"/>
+        </w:rPr>
         <w:t xml:space="preserve"> </w:t>
       </w:r>
       <w:r>
         <w:rPr>
-          <w:rStyle w:val="citation-786"/>
-        </w:rPr>
-        <w:t xml:space="preserve"> </w:t>
-      </w:r>
-      <w:r>
+          <w:lang w:val="fr-CA"/>
+        </w:rPr>
         <w:t>En cas d'égalité de grade entre l'attaquant et le défenseur, les deux pièces doivent être retirées du plateau.</w:t>
       </w:r>
-    </w:p>
-    <w:p/>
+      <w:r>
+        <w:rPr>
+          <w:lang w:val="fr-CA"/>
+        </w:rPr>
+        <w:t xml:space="preserve"> Le combat est affiché à l’écran quelques secondes pour que l’utilisateur soit au courant du combat.</w:t>
+      </w:r>
+    </w:p>
+    <w:p>
+      <w:pPr>
+        <w:rPr>
+          <w:lang w:val="fr-CA"/>
+        </w:rPr>
+      </w:pPr>
+    </w:p>
     <w:p>
       <w:pPr>
         <w:pBdr>
@@ -1751,29 +2499,35 @@
         <w:jc w:val="both"/>
         <w:rPr>
           <w:rFonts w:ascii="Segoe UI" w:hAnsi="Segoe UI" w:cs="Segoe UI"/>
+          <w:lang w:val="fr-CA"/>
         </w:rPr>
       </w:pPr>
       <w:r>
         <w:rPr>
           <w:b/>
           <w:bCs/>
+          <w:lang w:val="fr-CA"/>
         </w:rPr>
         <w:t>Description technique de haut niveau:</w:t>
       </w:r>
       <w:r>
         <w:rPr>
           <w:rFonts w:ascii="Segoe UI" w:hAnsi="Segoe UI" w:cs="Segoe UI"/>
+          <w:lang w:val="fr-CA"/>
         </w:rPr>
         <w:t xml:space="preserve"> </w:t>
       </w:r>
       <w:r>
-        <w:t xml:space="preserve">Lors d'un combat, le programme vérifie les grades des deux pièces qui se rencontrent. Il compare </w:t>
-      </w:r>
-      <w:r>
-        <w:t>statistiques</w:t>
-      </w:r>
-      <w:r>
-        <w:t>, applique les règles spéciales (comme l’Espion qui bat le Maréchal) et retire automatiquement la pièce perdante du plateau.</w:t>
+        <w:rPr>
+          <w:lang w:val="fr-CA"/>
+        </w:rPr>
+        <w:t>Lors d'un combat, le programme vérifie les grades des deux pièces qui se rencontrent. Il compare statistiques, applique les règles spéciales (comme l’Espion qui bat le Maréchal) et retire automatiquement la pièce perdante du plateau.</w:t>
+      </w:r>
+      <w:r>
+        <w:rPr>
+          <w:lang w:val="fr-CA"/>
+        </w:rPr>
+        <w:t xml:space="preserve"> </w:t>
       </w:r>
     </w:p>
     <w:p>
@@ -1810,146 +2564,287 @@
       </w:pPr>
     </w:p>
     <w:p>
+      <w:pPr>
+        <w:rPr>
+          <w:lang w:val="fr-CA"/>
+        </w:rPr>
+      </w:pPr>
       <w:r>
         <w:rPr>
           <w:b/>
           <w:bCs/>
+          <w:lang w:val="fr-CA"/>
         </w:rPr>
         <w:t>Description:</w:t>
       </w:r>
       <w:r>
+        <w:rPr>
+          <w:lang w:val="fr-CA"/>
+        </w:rPr>
         <w:t xml:space="preserve"> </w:t>
       </w:r>
       <w:r>
         <w:rPr>
           <w:rStyle w:val="citation-868"/>
+          <w:lang w:val="fr-CA"/>
         </w:rPr>
         <w:tab/>
       </w:r>
       <w:r>
+        <w:rPr>
+          <w:lang w:val="fr-CA"/>
+        </w:rPr>
         <w:t>Le joueur peut choisir d'affronter une IA avec trois niveaux de compétence (Facile, Moyen, Difficile). L'IA adapte sa stratégie de mouvement et d'attaque selon le niveau choisi.</w:t>
       </w:r>
     </w:p>
-    <w:p/>
-    <w:p>
+    <w:p>
+      <w:pPr>
+        <w:rPr>
+          <w:lang w:val="fr-CA"/>
+        </w:rPr>
+      </w:pPr>
+    </w:p>
+    <w:p>
+      <w:pPr>
+        <w:rPr>
+          <w:lang w:val="fr-CA"/>
+        </w:rPr>
+      </w:pPr>
       <w:r>
         <w:rPr>
           <w:b/>
           <w:bCs/>
+          <w:lang w:val="fr-CA"/>
         </w:rPr>
         <w:t>Utilisateurs concernés :</w:t>
       </w:r>
       <w:r>
+        <w:rPr>
+          <w:lang w:val="fr-CA"/>
+        </w:rPr>
+        <w:t xml:space="preserve"> Joueurs, Équipe technique </w:t>
+      </w:r>
+    </w:p>
+    <w:p>
+      <w:pPr>
+        <w:rPr>
+          <w:rStyle w:val="citation-868"/>
+          <w:lang w:val="fr-CA"/>
+        </w:rPr>
+      </w:pPr>
+    </w:p>
+    <w:p>
+      <w:pPr>
+        <w:rPr>
+          <w:lang w:val="fr-CA"/>
+        </w:rPr>
+      </w:pPr>
+      <w:r>
+        <w:rPr>
+          <w:b/>
+          <w:bCs/>
+          <w:lang w:val="fr-CA"/>
+        </w:rPr>
+        <w:t xml:space="preserve">Importance : </w:t>
+      </w:r>
+      <w:r>
+        <w:rPr>
+          <w:lang w:val="fr-CA"/>
+        </w:rPr>
+        <w:t>Indispensable</w:t>
+      </w:r>
+    </w:p>
+    <w:p>
+      <w:pPr>
+        <w:rPr>
+          <w:lang w:val="fr-CA"/>
+        </w:rPr>
+      </w:pPr>
+    </w:p>
+    <w:p>
+      <w:pPr>
+        <w:rPr>
+          <w:lang w:val="fr-CA"/>
+        </w:rPr>
+      </w:pPr>
+      <w:r>
+        <w:rPr>
+          <w:b/>
+          <w:bCs/>
+          <w:lang w:val="fr-CA"/>
+        </w:rPr>
+        <w:t>Contrainte du client:</w:t>
+      </w:r>
+      <w:r>
+        <w:rPr>
+          <w:lang w:val="fr-CA"/>
+        </w:rPr>
         <w:t xml:space="preserve"> </w:t>
       </w:r>
       <w:r>
-        <w:t xml:space="preserve">Joueurs, Équipe technique </w:t>
-      </w:r>
-    </w:p>
-    <w:p>
-      <w:pPr>
-        <w:rPr>
-          <w:rStyle w:val="citation-868"/>
-        </w:rPr>
-      </w:pPr>
-    </w:p>
-    <w:p>
+        <w:rPr>
+          <w:rStyle w:val="citation-786"/>
+          <w:lang w:val="fr-CA"/>
+        </w:rPr>
+        <w:t xml:space="preserve"> </w:t>
+      </w:r>
+      <w:r>
+        <w:rPr>
+          <w:lang w:val="fr-CA"/>
+        </w:rPr>
+        <w:t>L'IA ne doit pas tricher</w:t>
+      </w:r>
+      <w:r>
+        <w:rPr>
+          <w:lang w:val="fr-CA"/>
+        </w:rPr>
+        <w:t xml:space="preserve">: </w:t>
+      </w:r>
+      <w:r>
+        <w:rPr>
+          <w:lang w:val="fr-CA"/>
+        </w:rPr>
+        <w:t>elle ne doit pas voir les pièces cachées du joueur humain.</w:t>
+      </w:r>
+      <w:r>
+        <w:rPr>
+          <w:lang w:val="fr-CA"/>
+        </w:rPr>
+        <w:t xml:space="preserve"> </w:t>
+      </w:r>
+    </w:p>
+    <w:p>
+      <w:pPr>
+        <w:rPr>
+          <w:lang w:val="fr-CA"/>
+        </w:rPr>
+      </w:pPr>
+    </w:p>
+    <w:p>
+      <w:pPr>
+        <w:jc w:val="both"/>
+        <w:rPr>
+          <w:lang w:val="fr-CA"/>
+        </w:rPr>
+      </w:pPr>
       <w:r>
         <w:rPr>
           <w:b/>
           <w:bCs/>
-        </w:rPr>
-        <w:t>Importance :</w:t>
-      </w:r>
-      <w:r>
-        <w:rPr>
-          <w:b/>
-          <w:bCs/>
+          <w:lang w:val="fr-CA"/>
+        </w:rPr>
+        <w:t xml:space="preserve">Description technique de haut niveau: </w:t>
+      </w:r>
+      <w:r>
+        <w:rPr>
+          <w:lang w:val="fr-CA"/>
+        </w:rPr>
+        <w:t xml:space="preserve">Un algorithme de prise de décision analyse </w:t>
+      </w:r>
+      <w:r>
+        <w:rPr>
+          <w:lang w:val="fr-CA"/>
+        </w:rPr>
+        <w:t>le plateau et les pièces</w:t>
+      </w:r>
+      <w:r>
+        <w:rPr>
+          <w:lang w:val="fr-CA"/>
+        </w:rPr>
+        <w:t xml:space="preserve"> avec l’algorithme MCTS</w:t>
+      </w:r>
+      <w:r>
+        <w:rPr>
+          <w:lang w:val="fr-CA"/>
+        </w:rPr>
+        <w:t xml:space="preserve">. En mode facile, l'IA </w:t>
+      </w:r>
+      <w:r>
+        <w:rPr>
+          <w:lang w:val="fr-CA"/>
+        </w:rPr>
+        <w:t>ne mémorise pas les coups joués</w:t>
+      </w:r>
+      <w:r>
+        <w:rPr>
+          <w:lang w:val="fr-CA"/>
         </w:rPr>
         <w:t xml:space="preserve"> </w:t>
       </w:r>
       <w:r>
-        <w:t>Souhaitable</w:t>
-      </w:r>
-    </w:p>
-    <w:p/>
-    <w:p>
-      <w:r>
-        <w:rPr>
-          <w:b/>
-          <w:bCs/>
-        </w:rPr>
-        <w:t>Contrainte du client:</w:t>
-      </w:r>
-      <w:r>
+        <w:rPr>
+          <w:lang w:val="fr-CA"/>
+        </w:rPr>
+        <w:t>et effectue peu d’itérations de recherche</w:t>
+      </w:r>
+      <w:r>
+        <w:rPr>
+          <w:lang w:val="fr-CA"/>
+        </w:rPr>
+        <w:t xml:space="preserve">; </w:t>
+      </w:r>
+      <w:r>
+        <w:rPr>
+          <w:lang w:val="fr-CA"/>
+        </w:rPr>
+        <w:t xml:space="preserve">en mode moyen, l’IA mémorise les coups joués, mais effectue peu d’itération </w:t>
+      </w:r>
+      <w:r>
+        <w:rPr>
+          <w:lang w:val="fr-CA"/>
+        </w:rPr>
+        <w:t xml:space="preserve">de recherche; </w:t>
+      </w:r>
+      <w:r>
+        <w:rPr>
+          <w:lang w:val="fr-CA"/>
+        </w:rPr>
+        <w:t xml:space="preserve">en mode difficile, elle utilise une logique de mémorisation </w:t>
+      </w:r>
+      <w:r>
+        <w:rPr>
+          <w:lang w:val="fr-CA"/>
+        </w:rPr>
+        <w:lastRenderedPageBreak/>
+        <w:t xml:space="preserve">des pièces révélées pour prioriser ses </w:t>
+      </w:r>
+      <w:r>
+        <w:rPr>
+          <w:lang w:val="fr-CA"/>
+        </w:rPr>
+        <w:t>future</w:t>
+      </w:r>
+      <w:r>
+        <w:rPr>
+          <w:lang w:val="fr-CA"/>
+        </w:rPr>
+        <w:t>s</w:t>
+      </w:r>
+      <w:r>
+        <w:rPr>
+          <w:lang w:val="fr-CA"/>
+        </w:rPr>
         <w:t xml:space="preserve"> </w:t>
       </w:r>
       <w:r>
         <w:rPr>
-          <w:rStyle w:val="citation-786"/>
-        </w:rPr>
-        <w:t xml:space="preserve"> </w:t>
-      </w:r>
-      <w:r>
-        <w:t>L'IA ne doit pas tricher</w:t>
-      </w:r>
-      <w:r>
-        <w:t xml:space="preserve">: </w:t>
-      </w:r>
-      <w:r>
-        <w:t>elle ne doit pas voir les pièces cachées du joueur humain.</w:t>
-      </w:r>
-    </w:p>
-    <w:p/>
-    <w:p>
-      <w:pPr>
-        <w:jc w:val="both"/>
-      </w:pPr>
-      <w:r>
-        <w:rPr>
-          <w:b/>
-          <w:bCs/>
-        </w:rPr>
-        <w:t>Description technique de haut niveau:</w:t>
-      </w:r>
-      <w:r>
-        <w:rPr>
-          <w:b/>
-          <w:bCs/>
-        </w:rPr>
-        <w:t xml:space="preserve"> </w:t>
-      </w:r>
-      <w:r>
-        <w:t xml:space="preserve">Un algorithme de prise de décision analyse </w:t>
-      </w:r>
-      <w:r>
-        <w:t>le plateau et les pièces</w:t>
-      </w:r>
-      <w:r>
-        <w:t xml:space="preserve">. En mode facile, l'IA </w:t>
-      </w:r>
-      <w:r>
-        <w:t>ne mémorise pas les coups joués</w:t>
-      </w:r>
-      <w:r>
-        <w:t xml:space="preserve"> ; en mode difficile, elle utilise une logique de mémorisation des pièces révélées pour prioriser ses </w:t>
-      </w:r>
-      <w:r>
-        <w:t xml:space="preserve">future </w:t>
-      </w:r>
-      <w:r>
-        <w:t>attaques.</w:t>
-      </w:r>
-    </w:p>
-    <w:p>
-      <w:pPr>
-        <w:pStyle w:val="Titre3"/>
-      </w:pPr>
-    </w:p>
-    <w:p/>
-    <w:p>
-      <w:bookmarkStart w:id="1" w:name="_GoBack"/>
-      <w:bookmarkEnd w:id="1"/>
+          <w:lang w:val="fr-CA"/>
+        </w:rPr>
+        <w:t>attaques</w:t>
+      </w:r>
+      <w:r>
+        <w:rPr>
+          <w:lang w:val="fr-CA"/>
+        </w:rPr>
+        <w:t xml:space="preserve"> et effectue une grande recherche avant d’effectuer un coup.</w:t>
+      </w:r>
+    </w:p>
+    <w:p>
+      <w:pPr>
+        <w:rPr>
+          <w:lang w:val="fr-CA"/>
+        </w:rPr>
+      </w:pPr>
     </w:p>
     <w:p>
       <w:pPr>
@@ -1966,7 +2861,6 @@
           <w:i/>
           <w:lang w:val="fr-CA"/>
         </w:rPr>
-        <w:lastRenderedPageBreak/>
         <w:t xml:space="preserve">Exigence 5 : Accessibilité </w:t>
       </w:r>
     </w:p>
@@ -1982,7 +2876,6 @@
           <w:bCs/>
           <w:sz w:val="22"/>
           <w:szCs w:val="22"/>
-          <w:lang w:val="en"/>
         </w:rPr>
         <w:t>Description :</w:t>
       </w:r>
@@ -1994,35 +2887,25 @@
           <w:rFonts w:ascii="Arial" w:eastAsia="Arial" w:hAnsi="Arial" w:cs="Arial"/>
           <w:sz w:val="22"/>
           <w:szCs w:val="22"/>
-          <w:lang w:val="en"/>
-        </w:rPr>
-        <w:t xml:space="preserve">Le </w:t>
-      </w:r>
-      <w:r>
-        <w:rPr>
-          <w:rFonts w:ascii="Arial" w:eastAsia="Arial" w:hAnsi="Arial" w:cs="Arial"/>
-          <w:sz w:val="22"/>
-          <w:szCs w:val="22"/>
-          <w:lang w:val="en"/>
-        </w:rPr>
-        <w:t>jeu</w:t>
-      </w:r>
-      <w:r>
-        <w:rPr>
-          <w:rFonts w:ascii="Arial" w:eastAsia="Arial" w:hAnsi="Arial" w:cs="Arial"/>
-          <w:sz w:val="22"/>
-          <w:szCs w:val="22"/>
-          <w:lang w:val="en"/>
-        </w:rPr>
-        <w:t xml:space="preserve"> doit proposer des options permettant de personnaliser l'affichage </w:t>
-      </w:r>
-      <w:r>
-        <w:rPr>
-          <w:rFonts w:ascii="Arial" w:eastAsia="Arial" w:hAnsi="Arial" w:cs="Arial"/>
-          <w:sz w:val="22"/>
-          <w:szCs w:val="22"/>
-          <w:lang w:val="en"/>
-        </w:rPr>
+        </w:rPr>
+        <w:t>Le jeu doit proposer des options permettant de personnaliser l'affichage pour s'adapter aux besoins de certains utilisateurs.</w:t>
+      </w:r>
+    </w:p>
+    <w:p>
+      <w:pPr>
+        <w:pStyle w:val="NormalWeb"/>
+      </w:pPr>
+      <w:r>
+        <w:rPr>
+          <w:rFonts w:ascii="Arial" w:eastAsia="Arial" w:hAnsi="Arial" w:cs="Arial"/>
+          <w:b/>
+          <w:bCs/>
+          <w:sz w:val="22"/>
+          <w:szCs w:val="22"/>
+        </w:rPr>
+        <w:t>Utilisateurs concernés:</w:t>
+      </w:r>
+      <w:r>
         <w:t xml:space="preserve"> </w:t>
       </w:r>
       <w:r>
@@ -2030,34 +2913,286 @@
           <w:rFonts w:ascii="Arial" w:eastAsia="Arial" w:hAnsi="Arial" w:cs="Arial"/>
           <w:sz w:val="22"/>
           <w:szCs w:val="22"/>
-          <w:lang w:val="en"/>
-        </w:rPr>
-        <w:t xml:space="preserve"> pour s'adapter aux besoins de </w:t>
-      </w:r>
-      <w:r>
-        <w:rPr>
-          <w:rFonts w:ascii="Arial" w:eastAsia="Arial" w:hAnsi="Arial" w:cs="Arial"/>
-          <w:sz w:val="22"/>
-          <w:szCs w:val="22"/>
-          <w:lang w:val="en"/>
-        </w:rPr>
-        <w:t xml:space="preserve">certains </w:t>
-      </w:r>
-      <w:r>
-        <w:rPr>
-          <w:rFonts w:ascii="Arial" w:eastAsia="Arial" w:hAnsi="Arial" w:cs="Arial"/>
-          <w:sz w:val="22"/>
-          <w:szCs w:val="22"/>
-          <w:lang w:val="en"/>
-        </w:rPr>
-        <w:t>utilisateurs</w:t>
-      </w:r>
-      <w:r>
-        <w:rPr>
-          <w:rFonts w:ascii="Arial" w:eastAsia="Arial" w:hAnsi="Arial" w:cs="Arial"/>
-          <w:sz w:val="22"/>
-          <w:szCs w:val="22"/>
-          <w:lang w:val="en"/>
+        </w:rPr>
+        <w:t>Joueurs, Équipe technique.</w:t>
+      </w:r>
+    </w:p>
+    <w:p>
+      <w:pPr>
+        <w:pStyle w:val="NormalWeb"/>
+      </w:pPr>
+      <w:r>
+        <w:rPr>
+          <w:rFonts w:ascii="Arial" w:eastAsia="Arial" w:hAnsi="Arial" w:cs="Arial"/>
+          <w:b/>
+          <w:bCs/>
+          <w:sz w:val="22"/>
+          <w:szCs w:val="22"/>
+        </w:rPr>
+        <w:t>Importance:</w:t>
+      </w:r>
+      <w:r>
+        <w:t xml:space="preserve"> </w:t>
+      </w:r>
+      <w:r>
+        <w:rPr>
+          <w:rFonts w:ascii="Arial" w:eastAsia="Arial" w:hAnsi="Arial" w:cs="Arial"/>
+          <w:sz w:val="22"/>
+          <w:szCs w:val="22"/>
+        </w:rPr>
+        <w:t>Souhaitable.</w:t>
+      </w:r>
+    </w:p>
+    <w:p>
+      <w:pPr>
+        <w:pStyle w:val="NormalWeb"/>
+      </w:pPr>
+      <w:r>
+        <w:rPr>
+          <w:rFonts w:ascii="Arial" w:eastAsia="Arial" w:hAnsi="Arial" w:cs="Arial"/>
+          <w:b/>
+          <w:bCs/>
+          <w:sz w:val="22"/>
+          <w:szCs w:val="22"/>
+        </w:rPr>
+        <w:t>Contrainte du client:</w:t>
+      </w:r>
+      <w:r>
+        <w:t xml:space="preserve"> </w:t>
+      </w:r>
+      <w:r>
+        <w:rPr>
+          <w:rFonts w:ascii="Arial" w:eastAsia="Arial" w:hAnsi="Arial" w:cs="Arial"/>
+          <w:sz w:val="22"/>
+          <w:szCs w:val="22"/>
+        </w:rPr>
+        <w:t>Les paramètres d'accessibilité doivent être modifiables en cours de partie, via un menu d'options superposé, sans avoir à quitter ou réinitialiser la session.</w:t>
+      </w:r>
+      <w:r>
+        <w:rPr>
+          <w:rFonts w:ascii="Arial" w:eastAsia="Arial" w:hAnsi="Arial" w:cs="Arial"/>
+          <w:sz w:val="22"/>
+          <w:szCs w:val="22"/>
+        </w:rPr>
+        <w:t xml:space="preserve"> Le jeu devra être supporté au moins en anglais et en français.</w:t>
+      </w:r>
+    </w:p>
+    <w:p>
+      <w:pPr>
+        <w:pStyle w:val="NormalWeb"/>
+      </w:pPr>
+      <w:r>
+        <w:rPr>
+          <w:rFonts w:ascii="Arial" w:eastAsia="Arial" w:hAnsi="Arial" w:cs="Arial"/>
+          <w:b/>
+          <w:bCs/>
+          <w:sz w:val="22"/>
+          <w:szCs w:val="22"/>
+        </w:rPr>
+        <w:t>Description technique de haut niveau:</w:t>
+      </w:r>
+      <w:r>
+        <w:t xml:space="preserve"> </w:t>
+      </w:r>
+      <w:r>
+        <w:rPr>
+          <w:rFonts w:ascii="Arial" w:eastAsia="Arial" w:hAnsi="Arial" w:cs="Arial"/>
+          <w:sz w:val="22"/>
+          <w:szCs w:val="22"/>
+        </w:rPr>
+        <w:t>Un sélecteur permet de basculer entre un mode normal et un mode "Contraste élevé".</w:t>
+      </w:r>
+      <w:r>
+        <w:rPr>
+          <w:rFonts w:ascii="Arial" w:eastAsia="Arial" w:hAnsi="Arial" w:cs="Arial"/>
+          <w:sz w:val="22"/>
+          <w:szCs w:val="22"/>
+        </w:rPr>
+        <w:t xml:space="preserve"> Il devra aussi permettre de supprimer les animations. </w:t>
+      </w:r>
+    </w:p>
+    <w:p>
+      <w:pPr>
+        <w:pStyle w:val="NormalWeb"/>
+        <w:rPr>
+          <w:rFonts w:ascii="Arial" w:eastAsia="Arial" w:hAnsi="Arial" w:cs="Arial"/>
+          <w:sz w:val="22"/>
+          <w:szCs w:val="22"/>
+        </w:rPr>
+      </w:pPr>
+      <w:r>
+        <w:rPr>
+          <w:rFonts w:ascii="Arial" w:eastAsia="Arial" w:hAnsi="Arial" w:cs="Arial"/>
+          <w:b/>
+          <w:bCs/>
+          <w:sz w:val="22"/>
+          <w:szCs w:val="22"/>
+        </w:rPr>
+        <w:t>Contraintes de mise en œuvre:</w:t>
+      </w:r>
+      <w:r>
+        <w:t xml:space="preserve"> </w:t>
+      </w:r>
+      <w:r>
+        <w:rPr>
+          <w:rFonts w:ascii="Arial" w:eastAsia="Arial" w:hAnsi="Arial" w:cs="Arial"/>
+          <w:sz w:val="22"/>
+          <w:szCs w:val="22"/>
+        </w:rPr>
+        <w:t xml:space="preserve">Les préférences d'ergonomie doivent être sauvegardées </w:t>
+      </w:r>
+      <w:r>
+        <w:rPr>
+          <w:rFonts w:ascii="Arial" w:eastAsia="Arial" w:hAnsi="Arial" w:cs="Arial"/>
+          <w:sz w:val="22"/>
+          <w:szCs w:val="22"/>
+        </w:rPr>
+        <w:t>dans la table du profil. Lors de la connexion, le logiciel va aller chercher la valeur dans la base de données et affichera le jeu en conséquence.</w:t>
+      </w:r>
+    </w:p>
+    <w:p>
+      <w:pPr>
+        <w:pStyle w:val="NormalWeb"/>
+        <w:rPr>
+          <w:rFonts w:ascii="Arial" w:eastAsia="Arial" w:hAnsi="Arial" w:cs="Arial"/>
+          <w:sz w:val="22"/>
+          <w:szCs w:val="22"/>
+        </w:rPr>
+      </w:pPr>
+    </w:p>
+    <w:p>
+      <w:pPr>
+        <w:pStyle w:val="Titre4"/>
+        <w:rPr>
+          <w:b/>
+          <w:i/>
+          <w:lang w:val="fr-CA"/>
+        </w:rPr>
+      </w:pPr>
+      <w:r>
+        <w:rPr>
+          <w:b/>
+          <w:i/>
+          <w:lang w:val="fr-CA"/>
+        </w:rPr>
+        <w:t xml:space="preserve">Exigence </w:t>
+      </w:r>
+      <w:r>
+        <w:rPr>
+          <w:b/>
+          <w:i/>
+          <w:lang w:val="fr-CA"/>
+        </w:rPr>
+        <w:t>6</w:t>
+      </w:r>
+      <w:r>
+        <w:rPr>
+          <w:b/>
+          <w:i/>
+          <w:lang w:val="fr-CA"/>
+        </w:rPr>
+        <w:t xml:space="preserve"> : </w:t>
+      </w:r>
+      <w:r>
+        <w:rPr>
+          <w:b/>
+          <w:i/>
+          <w:lang w:val="fr-CA"/>
+        </w:rPr>
+        <w:t>Fin de partie</w:t>
+      </w:r>
+      <w:r>
+        <w:rPr>
+          <w:b/>
+          <w:i/>
+          <w:lang w:val="fr-CA"/>
+        </w:rPr>
+        <w:t xml:space="preserve"> </w:t>
+      </w:r>
+    </w:p>
+    <w:p>
+      <w:pPr>
+        <w:pStyle w:val="NormalWeb"/>
+        <w:jc w:val="both"/>
+      </w:pPr>
+      <w:r>
+        <w:rPr>
+          <w:rFonts w:ascii="Arial" w:eastAsia="Arial" w:hAnsi="Arial" w:cs="Arial"/>
+          <w:b/>
+          <w:bCs/>
+          <w:sz w:val="22"/>
+          <w:szCs w:val="22"/>
+        </w:rPr>
+        <w:t>Description :</w:t>
+      </w:r>
+      <w:r>
+        <w:t xml:space="preserve"> </w:t>
+      </w:r>
+      <w:r>
+        <w:rPr>
+          <w:rFonts w:ascii="Arial" w:eastAsia="Arial" w:hAnsi="Arial" w:cs="Arial"/>
+          <w:sz w:val="22"/>
+          <w:szCs w:val="22"/>
+        </w:rPr>
+        <w:t>Le jeu doit gérer automatiquement les conditions de fin de partie.</w:t>
+      </w:r>
+    </w:p>
+    <w:p>
+      <w:pPr>
+        <w:pStyle w:val="NormalWeb"/>
+      </w:pPr>
+      <w:r>
+        <w:rPr>
+          <w:rFonts w:ascii="Arial" w:eastAsia="Arial" w:hAnsi="Arial" w:cs="Arial"/>
+          <w:b/>
+          <w:bCs/>
+          <w:sz w:val="22"/>
+          <w:szCs w:val="22"/>
+        </w:rPr>
+        <w:t>Utilisateurs concernés:</w:t>
+      </w:r>
+      <w:r>
+        <w:t xml:space="preserve"> </w:t>
+      </w:r>
+      <w:r>
+        <w:rPr>
+          <w:rFonts w:ascii="Arial" w:eastAsia="Arial" w:hAnsi="Arial" w:cs="Arial"/>
+          <w:sz w:val="22"/>
+          <w:szCs w:val="22"/>
+        </w:rPr>
+        <w:t>Joueurs, Équipe technique.</w:t>
+      </w:r>
+    </w:p>
+    <w:p>
+      <w:pPr>
+        <w:pStyle w:val="NormalWeb"/>
+      </w:pPr>
+      <w:r>
+        <w:rPr>
+          <w:rFonts w:ascii="Arial" w:eastAsia="Arial" w:hAnsi="Arial" w:cs="Arial"/>
+          <w:b/>
+          <w:bCs/>
+          <w:sz w:val="22"/>
+          <w:szCs w:val="22"/>
+        </w:rPr>
+        <w:t>Importance:</w:t>
+      </w:r>
+      <w:r>
+        <w:t xml:space="preserve"> </w:t>
+      </w:r>
+      <w:r>
+        <w:rPr>
+          <w:rFonts w:ascii="Arial" w:eastAsia="Arial" w:hAnsi="Arial" w:cs="Arial"/>
+          <w:sz w:val="22"/>
+          <w:szCs w:val="22"/>
+        </w:rPr>
+        <w:t>Indispensable</w:t>
+      </w:r>
+      <w:r>
+        <w:rPr>
+          <w:rFonts w:ascii="Arial" w:eastAsia="Arial" w:hAnsi="Arial" w:cs="Arial"/>
+          <w:sz w:val="22"/>
+          <w:szCs w:val="22"/>
         </w:rPr>
         <w:t>.</w:t>
       </w:r>
@@ -2073,7 +3208,180 @@
           <w:bCs/>
           <w:sz w:val="22"/>
           <w:szCs w:val="22"/>
-          <w:lang w:val="en"/>
+        </w:rPr>
+        <w:t>Contrainte du client:</w:t>
+      </w:r>
+      <w:r>
+        <w:t xml:space="preserve"> </w:t>
+      </w:r>
+      <w:r>
+        <w:rPr>
+          <w:rFonts w:ascii="Arial" w:eastAsia="Arial" w:hAnsi="Arial" w:cs="Arial"/>
+          <w:sz w:val="22"/>
+          <w:szCs w:val="22"/>
+        </w:rPr>
+        <w:t xml:space="preserve">Lorsque l’une des conditions de fin de partie est atteinte, le jeu doit gérer automatiquement la suite. </w:t>
+      </w:r>
+    </w:p>
+    <w:p>
+      <w:pPr>
+        <w:pStyle w:val="NormalWeb"/>
+      </w:pPr>
+      <w:r>
+        <w:rPr>
+          <w:rFonts w:ascii="Arial" w:eastAsia="Arial" w:hAnsi="Arial" w:cs="Arial"/>
+          <w:b/>
+          <w:bCs/>
+          <w:sz w:val="22"/>
+          <w:szCs w:val="22"/>
+        </w:rPr>
+        <w:t>Description technique de haut niveau:</w:t>
+      </w:r>
+      <w:r>
+        <w:t xml:space="preserve"> </w:t>
+      </w:r>
+      <w:r>
+        <w:rPr>
+          <w:rFonts w:ascii="Arial" w:eastAsia="Arial" w:hAnsi="Arial" w:cs="Arial"/>
+          <w:sz w:val="22"/>
+          <w:szCs w:val="22"/>
+        </w:rPr>
+        <w:t xml:space="preserve">Un observer (design pattern) sera placé sur la liste de pièces de chaque joueur. L’observer notifie le jeu si un des joueurs remplit une ou l’autre des conditions de fin de jeu. Le jeu sera automatiquement terminé. </w:t>
+      </w:r>
+    </w:p>
+    <w:p>
+      <w:pPr>
+        <w:pStyle w:val="NormalWeb"/>
+        <w:rPr>
+          <w:rFonts w:ascii="Arial" w:eastAsia="Arial" w:hAnsi="Arial" w:cs="Arial"/>
+          <w:sz w:val="22"/>
+          <w:szCs w:val="22"/>
+        </w:rPr>
+      </w:pPr>
+      <w:r>
+        <w:rPr>
+          <w:rFonts w:ascii="Arial" w:eastAsia="Arial" w:hAnsi="Arial" w:cs="Arial"/>
+          <w:b/>
+          <w:bCs/>
+          <w:sz w:val="22"/>
+          <w:szCs w:val="22"/>
+        </w:rPr>
+        <w:t>Contraintes de mise en œuvre:</w:t>
+      </w:r>
+      <w:r>
+        <w:t xml:space="preserve"> </w:t>
+      </w:r>
+      <w:r>
+        <w:rPr>
+          <w:rFonts w:ascii="Arial" w:eastAsia="Arial" w:hAnsi="Arial" w:cs="Arial"/>
+          <w:sz w:val="22"/>
+          <w:szCs w:val="22"/>
+        </w:rPr>
+        <w:t>L</w:t>
+      </w:r>
+      <w:r>
+        <w:rPr>
+          <w:rFonts w:ascii="Arial" w:eastAsia="Arial" w:hAnsi="Arial" w:cs="Arial"/>
+          <w:sz w:val="22"/>
+          <w:szCs w:val="22"/>
+        </w:rPr>
+        <w:t xml:space="preserve">e patron sera installé du côté serveur, comme c’est lui qui va gérer le jeu (contrôleur). </w:t>
+      </w:r>
+    </w:p>
+    <w:p>
+      <w:pPr>
+        <w:pStyle w:val="NormalWeb"/>
+      </w:pPr>
+    </w:p>
+    <w:p>
+      <w:pPr>
+        <w:pStyle w:val="Titre4"/>
+        <w:rPr>
+          <w:b/>
+          <w:i/>
+          <w:lang w:val="fr-CA"/>
+        </w:rPr>
+      </w:pPr>
+      <w:r>
+        <w:rPr>
+          <w:b/>
+          <w:i/>
+          <w:lang w:val="fr-CA"/>
+        </w:rPr>
+        <w:lastRenderedPageBreak/>
+        <w:t xml:space="preserve">Exigence </w:t>
+      </w:r>
+      <w:r>
+        <w:rPr>
+          <w:b/>
+          <w:i/>
+          <w:lang w:val="fr-CA"/>
+        </w:rPr>
+        <w:t>7</w:t>
+      </w:r>
+      <w:r>
+        <w:rPr>
+          <w:b/>
+          <w:i/>
+          <w:lang w:val="fr-CA"/>
+        </w:rPr>
+        <w:t xml:space="preserve"> : </w:t>
+      </w:r>
+      <w:r>
+        <w:rPr>
+          <w:b/>
+          <w:i/>
+          <w:lang w:val="fr-CA"/>
+        </w:rPr>
+        <w:t>Apparence du jeu</w:t>
+      </w:r>
+    </w:p>
+    <w:p>
+      <w:pPr>
+        <w:pStyle w:val="NormalWeb"/>
+        <w:jc w:val="both"/>
+      </w:pPr>
+      <w:r>
+        <w:rPr>
+          <w:rFonts w:ascii="Arial" w:eastAsia="Arial" w:hAnsi="Arial" w:cs="Arial"/>
+          <w:b/>
+          <w:bCs/>
+          <w:sz w:val="22"/>
+          <w:szCs w:val="22"/>
+        </w:rPr>
+        <w:t>Description :</w:t>
+      </w:r>
+      <w:r>
+        <w:t xml:space="preserve"> </w:t>
+      </w:r>
+      <w:r>
+        <w:rPr>
+          <w:rFonts w:ascii="Arial" w:eastAsia="Arial" w:hAnsi="Arial" w:cs="Arial"/>
+          <w:sz w:val="22"/>
+          <w:szCs w:val="22"/>
+        </w:rPr>
+        <w:t>Le jeu devra ressembler au jeu physique</w:t>
+      </w:r>
+      <w:r>
+        <w:rPr>
+          <w:rFonts w:ascii="Arial" w:eastAsia="Arial" w:hAnsi="Arial" w:cs="Arial"/>
+          <w:sz w:val="22"/>
+          <w:szCs w:val="22"/>
+        </w:rPr>
+        <w:t>.</w:t>
+      </w:r>
+    </w:p>
+    <w:p>
+      <w:pPr>
+        <w:pStyle w:val="NormalWeb"/>
+      </w:pPr>
+      <w:r>
+        <w:rPr>
+          <w:rFonts w:ascii="Arial" w:eastAsia="Arial" w:hAnsi="Arial" w:cs="Arial"/>
+          <w:b/>
+          <w:bCs/>
+          <w:sz w:val="22"/>
+          <w:szCs w:val="22"/>
         </w:rPr>
         <w:t>Utilisateurs concernés:</w:t>
       </w:r>
@@ -2085,7 +3393,6 @@
           <w:rFonts w:ascii="Arial" w:eastAsia="Arial" w:hAnsi="Arial" w:cs="Arial"/>
           <w:sz w:val="22"/>
           <w:szCs w:val="22"/>
-          <w:lang w:val="en"/>
         </w:rPr>
         <w:t>Joueurs, Équipe technique.</w:t>
       </w:r>
@@ -2101,11 +3408,17 @@
           <w:bCs/>
           <w:sz w:val="22"/>
           <w:szCs w:val="22"/>
-          <w:lang w:val="en"/>
         </w:rPr>
         <w:t>Importance:</w:t>
       </w:r>
       <w:r>
+        <w:rPr>
+          <w:rFonts w:ascii="Arial" w:eastAsia="Arial" w:hAnsi="Arial" w:cs="Arial"/>
+          <w:b/>
+          <w:bCs/>
+          <w:sz w:val="22"/>
+          <w:szCs w:val="22"/>
+        </w:rPr>
         <w:t xml:space="preserve"> </w:t>
       </w:r>
       <w:r>
@@ -2113,9 +3426,16 @@
           <w:rFonts w:ascii="Arial" w:eastAsia="Arial" w:hAnsi="Arial" w:cs="Arial"/>
           <w:sz w:val="22"/>
           <w:szCs w:val="22"/>
-          <w:lang w:val="en"/>
-        </w:rPr>
-        <w:t>Souhaitable.</w:t>
+        </w:rPr>
+        <w:t>Indispensable</w:t>
+      </w:r>
+      <w:r>
+        <w:rPr>
+          <w:rFonts w:ascii="Arial" w:eastAsia="Arial" w:hAnsi="Arial" w:cs="Arial"/>
+          <w:sz w:val="22"/>
+          <w:szCs w:val="22"/>
+        </w:rPr>
+        <w:t>.</w:t>
       </w:r>
     </w:p>
     <w:p>
@@ -2129,7 +3449,6 @@
           <w:bCs/>
           <w:sz w:val="22"/>
           <w:szCs w:val="22"/>
-          <w:lang w:val="en"/>
         </w:rPr>
         <w:t>Contrainte du client:</w:t>
       </w:r>
@@ -2141,9 +3460,16 @@
           <w:rFonts w:ascii="Arial" w:eastAsia="Arial" w:hAnsi="Arial" w:cs="Arial"/>
           <w:sz w:val="22"/>
           <w:szCs w:val="22"/>
-          <w:lang w:val="en"/>
-        </w:rPr>
-        <w:t>Les paramètres d'accessibilité doivent être modifiables en cours de partie, via un menu d'options superposé, sans avoir à quitter ou réinitialiser la session.</w:t>
+        </w:rPr>
+        <w:t>Le jeu devra ressembler à u</w:t>
+      </w:r>
+      <w:r>
+        <w:rPr>
+          <w:rFonts w:ascii="Arial" w:eastAsia="Arial" w:hAnsi="Arial" w:cs="Arial"/>
+          <w:sz w:val="22"/>
+          <w:szCs w:val="22"/>
+        </w:rPr>
+        <w:t>ne grille de 10x10 avec des pions, une zone intraversable, une représentation des pièces toujours en jeu pour joueur (type, nom, nombre). Le temps devra être affiché, ainsi qu’un menu d’options. Un avatar (identifiant, score), un chat entre joueurs et un indicateur de tour devront aussi être présents.</w:t>
       </w:r>
     </w:p>
     <w:p>
@@ -2157,7 +3483,6 @@
           <w:bCs/>
           <w:sz w:val="22"/>
           <w:szCs w:val="22"/>
-          <w:lang w:val="en"/>
         </w:rPr>
         <w:t>Description technique de haut niveau:</w:t>
       </w:r>
@@ -2169,9 +3494,8 @@
           <w:rFonts w:ascii="Arial" w:eastAsia="Arial" w:hAnsi="Arial" w:cs="Arial"/>
           <w:sz w:val="22"/>
           <w:szCs w:val="22"/>
-          <w:lang w:val="en"/>
-        </w:rPr>
-        <w:t>Un sélecteur permet de basculer entre un mode normal et un mode "Contraste élevé".</w:t>
+        </w:rPr>
+        <w:t xml:space="preserve">L’UI doit être réactif, personnalisable et modulaire. </w:t>
       </w:r>
     </w:p>
     <w:p>
@@ -2185,7 +3509,6 @@
           <w:bCs/>
           <w:sz w:val="22"/>
           <w:szCs w:val="22"/>
-          <w:lang w:val="en"/>
         </w:rPr>
         <w:t>Contraintes de mise en œuvre:</w:t>
       </w:r>
@@ -2197,69 +3520,35 @@
           <w:rFonts w:ascii="Arial" w:eastAsia="Arial" w:hAnsi="Arial" w:cs="Arial"/>
           <w:sz w:val="22"/>
           <w:szCs w:val="22"/>
-          <w:lang w:val="en"/>
-        </w:rPr>
-        <w:t xml:space="preserve">Les préférences d'ergonomie doivent être sauvegardées localement (LocalStorage) pour être conservées lors de la prochaine visite </w:t>
-      </w:r>
-      <w:r>
-        <w:rPr>
-          <w:rFonts w:ascii="Arial" w:eastAsia="Arial" w:hAnsi="Arial" w:cs="Arial"/>
-          <w:sz w:val="22"/>
-          <w:szCs w:val="22"/>
-          <w:lang w:val="en"/>
-        </w:rPr>
-        <w:t xml:space="preserve">du joueur </w:t>
-      </w:r>
-      <w:r>
-        <w:rPr>
-          <w:rFonts w:ascii="Arial" w:eastAsia="Arial" w:hAnsi="Arial" w:cs="Arial"/>
-          <w:sz w:val="22"/>
-          <w:szCs w:val="22"/>
-          <w:lang w:val="en"/>
-        </w:rPr>
-        <w:t xml:space="preserve"> sans nécessiter d'appel</w:t>
-      </w:r>
-      <w:r>
-        <w:rPr>
-          <w:rFonts w:ascii="Arial" w:eastAsia="Arial" w:hAnsi="Arial" w:cs="Arial"/>
-          <w:sz w:val="22"/>
-          <w:szCs w:val="22"/>
-          <w:lang w:val="en"/>
-        </w:rPr>
-        <w:t>er</w:t>
-      </w:r>
-      <w:r>
-        <w:rPr>
-          <w:rFonts w:ascii="Arial" w:eastAsia="Arial" w:hAnsi="Arial" w:cs="Arial"/>
-          <w:sz w:val="22"/>
-          <w:szCs w:val="22"/>
-          <w:lang w:val="en"/>
-        </w:rPr>
-        <w:t xml:space="preserve"> </w:t>
-      </w:r>
-      <w:r>
-        <w:rPr>
-          <w:rFonts w:ascii="Arial" w:eastAsia="Arial" w:hAnsi="Arial" w:cs="Arial"/>
-          <w:sz w:val="22"/>
-          <w:szCs w:val="22"/>
-          <w:lang w:val="en"/>
-        </w:rPr>
-        <w:t xml:space="preserve">la </w:t>
-      </w:r>
-      <w:r>
-        <w:rPr>
-          <w:rFonts w:ascii="Arial" w:eastAsia="Arial" w:hAnsi="Arial" w:cs="Arial"/>
-          <w:sz w:val="22"/>
-          <w:szCs w:val="22"/>
-          <w:lang w:val="en"/>
-        </w:rPr>
-        <w:t>base de données.</w:t>
-      </w:r>
-    </w:p>
-    <w:p>
-      <w:pPr>
-        <w:pStyle w:val="Titre3"/>
-      </w:pPr>
+        </w:rPr>
+        <w:t xml:space="preserve">Doit être fait en </w:t>
+      </w:r>
+      <w:proofErr w:type="spellStart"/>
+      <w:r>
+        <w:rPr>
+          <w:rFonts w:ascii="Arial" w:eastAsia="Arial" w:hAnsi="Arial" w:cs="Arial"/>
+          <w:sz w:val="22"/>
+          <w:szCs w:val="22"/>
+        </w:rPr>
+        <w:t>R</w:t>
+      </w:r>
+      <w:r>
+        <w:rPr>
+          <w:rFonts w:ascii="Arial" w:eastAsia="Arial" w:hAnsi="Arial" w:cs="Arial"/>
+          <w:sz w:val="22"/>
+          <w:szCs w:val="22"/>
+        </w:rPr>
+        <w:t>eact</w:t>
+      </w:r>
+      <w:proofErr w:type="spellEnd"/>
+      <w:r>
+        <w:rPr>
+          <w:rFonts w:ascii="Arial" w:eastAsia="Arial" w:hAnsi="Arial" w:cs="Arial"/>
+          <w:sz w:val="22"/>
+          <w:szCs w:val="22"/>
+        </w:rPr>
+        <w:t>.</w:t>
+      </w:r>
     </w:p>
     <w:p>
       <w:pPr>
@@ -2267,7 +3556,7 @@
       </w:pPr>
     </w:p>
     <w:sectPr>
-      <w:footerReference w:type="default" r:id="rId8"/>
+      <w:footerReference w:type="default" r:id="rId12"/>
       <w:pgSz w:w="12240" w:h="15840"/>
       <w:pgMar w:top="1440" w:right="1440" w:bottom="1440" w:left="1440" w:header="0" w:footer="720" w:gutter="0"/>
       <w:pgNumType w:start="1"/>
@@ -2277,8 +3566,47 @@
 </w:document>
 </file>
 
+<file path=word/comments.xml><?xml version="1.0" encoding="utf-8"?>
+<w:comments xmlns:wpc="http://schemas.microsoft.com/office/word/2010/wordprocessingCanvas" xmlns:cx="http://schemas.microsoft.com/office/drawing/2014/chartex" xmlns:cx1="http://schemas.microsoft.com/office/drawing/2015/9/8/chartex" xmlns:cx2="http://schemas.microsoft.com/office/drawing/2015/10/21/chartex" xmlns:cx3="http://schemas.microsoft.com/office/drawing/2016/5/9/chartex" xmlns:cx4="http://schemas.microsoft.com/office/drawing/2016/5/10/chartex" xmlns:cx5="http://schemas.microsoft.com/office/drawing/2016/5/11/chartex" xmlns:cx6="http://schemas.microsoft.com/office/drawing/2016/5/12/chartex" xmlns:cx7="http://schemas.microsoft.com/office/drawing/2016/5/13/chartex" xmlns:cx8="http://schemas.microsoft.com/office/drawing/2016/5/14/chartex" xmlns:mc="http://schemas.openxmlformats.org/markup-compatibility/2006" xmlns:aink="http://schemas.microsoft.com/office/drawing/2016/ink" xmlns:am3d="http://schemas.microsoft.com/office/drawing/2017/model3d" xmlns:o="urn:schemas-microsoft-com:office:office" xmlns:oel="http://schemas.microsoft.com/office/2019/extlst" xmlns:r="http://schemas.openxmlformats.org/officeDocument/2006/relationships" xmlns:m="http://schemas.openxmlformats.org/officeDocument/2006/math" xmlns:v="urn:schemas-microsoft-com:vml" xmlns:wp14="http://schemas.microsoft.com/office/word/2010/wordprocessingDrawing" xmlns:wp="http://schemas.openxmlformats.org/drawingml/2006/wordprocessingDrawing" xmlns:w10="urn:schemas-microsoft-com:office:word" xmlns:w="http://schemas.openxmlformats.org/wordprocessingml/2006/main" xmlns:w14="http://schemas.microsoft.com/office/word/2010/wordml" xmlns:w15="http://schemas.microsoft.com/office/word/2012/wordml" xmlns:w16cex="http://schemas.microsoft.com/office/word/2018/wordml/cex" xmlns:w16cid="http://schemas.microsoft.com/office/word/2016/wordml/cid" xmlns:w16="http://schemas.microsoft.com/office/word/2018/wordml" xmlns:w16du="http://schemas.microsoft.com/office/word/2023/wordml/word16du" xmlns:w16sdtdh="http://schemas.microsoft.com/office/word/2020/wordml/sdtdatahash" xmlns:w16sdtfl="http://schemas.microsoft.com/office/word/2024/wordml/sdtformatlock" xmlns:w16se="http://schemas.microsoft.com/office/word/2015/wordml/symex" xmlns:wpg="http://schemas.microsoft.com/office/word/2010/wordprocessingGroup" xmlns:wpi="http://schemas.microsoft.com/office/word/2010/wordprocessingInk" xmlns:wne="http://schemas.microsoft.com/office/word/2006/wordml" xmlns:wps="http://schemas.microsoft.com/office/word/2010/wordprocessingShape" mc:Ignorable="w14 w15 w16se w16cid w16 w16cex w16sdtdh w16sdtfl w16du wp14">
+  <w:comment w:id="1" w:author="Dupras Charlotte" w:date="2026-02-02T11:02:00Z" w:initials="CD">
+    <w:p>
+      <w:pPr>
+        <w:pStyle w:val="Commentaire"/>
+      </w:pPr>
+      <w:r>
+        <w:rPr>
+          <w:rStyle w:val="Marquedecommentaire"/>
+        </w:rPr>
+        <w:annotationRef/>
+      </w:r>
+      <w:r>
+        <w:t>temps</w:t>
+      </w:r>
+    </w:p>
+  </w:comment>
+</w:comments>
+</file>
+
+<file path=word/commentsExtended.xml><?xml version="1.0" encoding="utf-8"?>
+<w15:commentsEx xmlns:wpc="http://schemas.microsoft.com/office/word/2010/wordprocessingCanvas" xmlns:cx="http://schemas.microsoft.com/office/drawing/2014/chartex" xmlns:cx1="http://schemas.microsoft.com/office/drawing/2015/9/8/chartex" xmlns:cx2="http://schemas.microsoft.com/office/drawing/2015/10/21/chartex" xmlns:cx3="http://schemas.microsoft.com/office/drawing/2016/5/9/chartex" xmlns:cx4="http://schemas.microsoft.com/office/drawing/2016/5/10/chartex" xmlns:cx5="http://schemas.microsoft.com/office/drawing/2016/5/11/chartex" xmlns:cx6="http://schemas.microsoft.com/office/drawing/2016/5/12/chartex" xmlns:cx7="http://schemas.microsoft.com/office/drawing/2016/5/13/chartex" xmlns:cx8="http://schemas.microsoft.com/office/drawing/2016/5/14/chartex" xmlns:mc="http://schemas.openxmlformats.org/markup-compatibility/2006" xmlns:aink="http://schemas.microsoft.com/office/drawing/2016/ink" xmlns:am3d="http://schemas.microsoft.com/office/drawing/2017/model3d" xmlns:o="urn:schemas-microsoft-com:office:office" xmlns:oel="http://schemas.microsoft.com/office/2019/extlst" xmlns:r="http://schemas.openxmlformats.org/officeDocument/2006/relationships" xmlns:m="http://schemas.openxmlformats.org/officeDocument/2006/math" xmlns:v="urn:schemas-microsoft-com:vml" xmlns:wp14="http://schemas.microsoft.com/office/word/2010/wordprocessingDrawing" xmlns:wp="http://schemas.openxmlformats.org/drawingml/2006/wordprocessingDrawing" xmlns:w10="urn:schemas-microsoft-com:office:word" xmlns:w="http://schemas.openxmlformats.org/wordprocessingml/2006/main" xmlns:w14="http://schemas.microsoft.com/office/word/2010/wordml" xmlns:w15="http://schemas.microsoft.com/office/word/2012/wordml" xmlns:w16cex="http://schemas.microsoft.com/office/word/2018/wordml/cex" xmlns:w16cid="http://schemas.microsoft.com/office/word/2016/wordml/cid" xmlns:w16="http://schemas.microsoft.com/office/word/2018/wordml" xmlns:w16du="http://schemas.microsoft.com/office/word/2023/wordml/word16du" xmlns:w16sdtdh="http://schemas.microsoft.com/office/word/2020/wordml/sdtdatahash" xmlns:w16sdtfl="http://schemas.microsoft.com/office/word/2024/wordml/sdtformatlock" xmlns:w16se="http://schemas.microsoft.com/office/word/2015/wordml/symex" xmlns:wpg="http://schemas.microsoft.com/office/word/2010/wordprocessingGroup" xmlns:wpi="http://schemas.microsoft.com/office/word/2010/wordprocessingInk" xmlns:wne="http://schemas.microsoft.com/office/word/2006/wordml" xmlns:wps="http://schemas.microsoft.com/office/word/2010/wordprocessingShape" mc:Ignorable="w14 w15 w16se w16cid w16 w16cex w16sdtdh w16sdtfl w16du wp14">
+  <w15:commentEx w15:paraId="601473DB" w15:done="0"/>
+</w15:commentsEx>
+</file>
+
+<file path=word/commentsExtensible.xml><?xml version="1.0" encoding="utf-8"?>
+<w16cex:commentsExtensible xmlns:wpc="http://schemas.microsoft.com/office/word/2010/wordprocessingCanvas" xmlns:cx="http://schemas.microsoft.com/office/drawing/2014/chartex" xmlns:cx1="http://schemas.microsoft.com/office/drawing/2015/9/8/chartex" xmlns:cx2="http://schemas.microsoft.com/office/drawing/2015/10/21/chartex" xmlns:cx3="http://schemas.microsoft.com/office/drawing/2016/5/9/chartex" xmlns:cx4="http://schemas.microsoft.com/office/drawing/2016/5/10/chartex" xmlns:cx5="http://schemas.microsoft.com/office/drawing/2016/5/11/chartex" xmlns:cx6="http://schemas.microsoft.com/office/drawing/2016/5/12/chartex" xmlns:cx7="http://schemas.microsoft.com/office/drawing/2016/5/13/chartex" xmlns:cx8="http://schemas.microsoft.com/office/drawing/2016/5/14/chartex" xmlns:cr="http://schemas.microsoft.com/office/comments/2020/reactions" xmlns:mc="http://schemas.openxmlformats.org/markup-compatibility/2006" xmlns:aink="http://schemas.microsoft.com/office/drawing/2016/ink" xmlns:am3d="http://schemas.microsoft.com/office/drawing/2017/model3d" xmlns:o="urn:schemas-microsoft-com:office:office" xmlns:oel="http://schemas.microsoft.com/office/2019/extlst" xmlns:r="http://schemas.openxmlformats.org/officeDocument/2006/relationships" xmlns:m="http://schemas.openxmlformats.org/officeDocument/2006/math" xmlns:v="urn:schemas-microsoft-com:vml" xmlns:wp14="http://schemas.microsoft.com/office/word/2010/wordprocessingDrawing" xmlns:wp="http://schemas.openxmlformats.org/drawingml/2006/wordprocessingDrawing" xmlns:w10="urn:schemas-microsoft-com:office:word" xmlns:w="http://schemas.openxmlformats.org/wordprocessingml/2006/main" xmlns:w14="http://schemas.microsoft.com/office/word/2010/wordml" xmlns:w15="http://schemas.microsoft.com/office/word/2012/wordml" xmlns:w16cex="http://schemas.microsoft.com/office/word/2018/wordml/cex" xmlns:w16cid="http://schemas.microsoft.com/office/word/2016/wordml/cid" xmlns:w16="http://schemas.microsoft.com/office/word/2018/wordml" xmlns:w16du="http://schemas.microsoft.com/office/word/2023/wordml/word16du" xmlns:w16sdtdh="http://schemas.microsoft.com/office/word/2020/wordml/sdtdatahash" xmlns:w16sdtfl="http://schemas.microsoft.com/office/word/2024/wordml/sdtformatlock" xmlns:w16se="http://schemas.microsoft.com/office/word/2015/wordml/symex" xmlns:wpg="http://schemas.microsoft.com/office/word/2010/wordprocessingGroup" xmlns:wpi="http://schemas.microsoft.com/office/word/2010/wordprocessingInk" xmlns:wne="http://schemas.microsoft.com/office/word/2006/wordml" xmlns:wps="http://schemas.microsoft.com/office/word/2010/wordprocessingShape" mc:Ignorable="w14 w15 w16se w16cid w16 w16cex w16sdtdh w16sdtfl cr w16du wp14">
+  <w16cex:commentExtensible w16cex:durableId="279421CD" w16cex:dateUtc="2026-02-02T16:02:00Z"/>
+</w16cex:commentsExtensible>
+</file>
+
+<file path=word/commentsIds.xml><?xml version="1.0" encoding="utf-8"?>
+<w16cid:commentsIds xmlns:wpc="http://schemas.microsoft.com/office/word/2010/wordprocessingCanvas" xmlns:cx="http://schemas.microsoft.com/office/drawing/2014/chartex" xmlns:cx1="http://schemas.microsoft.com/office/drawing/2015/9/8/chartex" xmlns:cx2="http://schemas.microsoft.com/office/drawing/2015/10/21/chartex" xmlns:cx3="http://schemas.microsoft.com/office/drawing/2016/5/9/chartex" xmlns:cx4="http://schemas.microsoft.com/office/drawing/2016/5/10/chartex" xmlns:cx5="http://schemas.microsoft.com/office/drawing/2016/5/11/chartex" xmlns:cx6="http://schemas.microsoft.com/office/drawing/2016/5/12/chartex" xmlns:cx7="http://schemas.microsoft.com/office/drawing/2016/5/13/chartex" xmlns:cx8="http://schemas.microsoft.com/office/drawing/2016/5/14/chartex" xmlns:mc="http://schemas.openxmlformats.org/markup-compatibility/2006" xmlns:aink="http://schemas.microsoft.com/office/drawing/2016/ink" xmlns:am3d="http://schemas.microsoft.com/office/drawing/2017/model3d" xmlns:o="urn:schemas-microsoft-com:office:office" xmlns:oel="http://schemas.microsoft.com/office/2019/extlst" xmlns:r="http://schemas.openxmlformats.org/officeDocument/2006/relationships" xmlns:m="http://schemas.openxmlformats.org/officeDocument/2006/math" xmlns:v="urn:schemas-microsoft-com:vml" xmlns:wp14="http://schemas.microsoft.com/office/word/2010/wordprocessingDrawing" xmlns:wp="http://schemas.openxmlformats.org/drawingml/2006/wordprocessingDrawing" xmlns:w10="urn:schemas-microsoft-com:office:word" xmlns:w="http://schemas.openxmlformats.org/wordprocessingml/2006/main" xmlns:w14="http://schemas.microsoft.com/office/word/2010/wordml" xmlns:w15="http://schemas.microsoft.com/office/word/2012/wordml" xmlns:w16cex="http://schemas.microsoft.com/office/word/2018/wordml/cex" xmlns:w16cid="http://schemas.microsoft.com/office/word/2016/wordml/cid" xmlns:w16="http://schemas.microsoft.com/office/word/2018/wordml" xmlns:w16du="http://schemas.microsoft.com/office/word/2023/wordml/word16du" xmlns:w16sdtdh="http://schemas.microsoft.com/office/word/2020/wordml/sdtdatahash" xmlns:w16sdtfl="http://schemas.microsoft.com/office/word/2024/wordml/sdtformatlock" xmlns:w16se="http://schemas.microsoft.com/office/word/2015/wordml/symex" xmlns:wpg="http://schemas.microsoft.com/office/word/2010/wordprocessingGroup" xmlns:wpi="http://schemas.microsoft.com/office/word/2010/wordprocessingInk" xmlns:wne="http://schemas.microsoft.com/office/word/2006/wordml" xmlns:wps="http://schemas.microsoft.com/office/word/2010/wordprocessingShape" mc:Ignorable="w14 w15 w16se w16cid w16 w16cex w16sdtdh w16sdtfl w16du wp14">
+  <w16cid:commentId w16cid:paraId="601473DB" w16cid:durableId="279421CD"/>
+</w16cid:commentsIds>
+</file>
+
 <file path=word/endnotes.xml><?xml version="1.0" encoding="utf-8"?>
-<w:endnotes xmlns:wpc="http://schemas.microsoft.com/office/word/2010/wordprocessingCanvas" xmlns:cx="http://schemas.microsoft.com/office/drawing/2014/chartex" xmlns:cx1="http://schemas.microsoft.com/office/drawing/2015/9/8/chartex" xmlns:cx2="http://schemas.microsoft.com/office/drawing/2015/10/21/chartex" xmlns:cx3="http://schemas.microsoft.com/office/drawing/2016/5/9/chartex" xmlns:cx4="http://schemas.microsoft.com/office/drawing/2016/5/10/chartex" xmlns:cx5="http://schemas.microsoft.com/office/drawing/2016/5/11/chartex" xmlns:cx6="http://schemas.microsoft.com/office/drawing/2016/5/12/chartex" xmlns:cx7="http://schemas.microsoft.com/office/drawing/2016/5/13/chartex" xmlns:cx8="http://schemas.microsoft.com/office/drawing/2016/5/14/chartex" xmlns:mc="http://schemas.openxmlformats.org/markup-compatibility/2006" xmlns:aink="http://schemas.microsoft.com/office/drawing/2016/ink" xmlns:am3d="http://schemas.microsoft.com/office/drawing/2017/model3d" xmlns:o="urn:schemas-microsoft-com:office:office" xmlns:r="http://schemas.openxmlformats.org/officeDocument/2006/relationships" xmlns:m="http://schemas.openxmlformats.org/officeDocument/2006/math" xmlns:v="urn:schemas-microsoft-com:vml" xmlns:wp14="http://schemas.microsoft.com/office/word/2010/wordprocessingDrawing" xmlns:wp="http://schemas.openxmlformats.org/drawingml/2006/wordprocessingDrawing" xmlns:w10="urn:schemas-microsoft-com:office:word" xmlns:w="http://schemas.openxmlformats.org/wordprocessingml/2006/main" xmlns:w14="http://schemas.microsoft.com/office/word/2010/wordml" xmlns:w15="http://schemas.microsoft.com/office/word/2012/wordml" xmlns:w16cid="http://schemas.microsoft.com/office/word/2016/wordml/cid" xmlns:w16se="http://schemas.microsoft.com/office/word/2015/wordml/symex" xmlns:wpg="http://schemas.microsoft.com/office/word/2010/wordprocessingGroup" xmlns:wpi="http://schemas.microsoft.com/office/word/2010/wordprocessingInk" xmlns:wne="http://schemas.microsoft.com/office/word/2006/wordml" xmlns:wps="http://schemas.microsoft.com/office/word/2010/wordprocessingShape" mc:Ignorable="w14 w15 w16se w16cid wp14">
+<w:endnotes xmlns:wpc="http://schemas.microsoft.com/office/word/2010/wordprocessingCanvas" xmlns:cx="http://schemas.microsoft.com/office/drawing/2014/chartex" xmlns:cx1="http://schemas.microsoft.com/office/drawing/2015/9/8/chartex" xmlns:cx2="http://schemas.microsoft.com/office/drawing/2015/10/21/chartex" xmlns:cx3="http://schemas.microsoft.com/office/drawing/2016/5/9/chartex" xmlns:cx4="http://schemas.microsoft.com/office/drawing/2016/5/10/chartex" xmlns:cx5="http://schemas.microsoft.com/office/drawing/2016/5/11/chartex" xmlns:cx6="http://schemas.microsoft.com/office/drawing/2016/5/12/chartex" xmlns:cx7="http://schemas.microsoft.com/office/drawing/2016/5/13/chartex" xmlns:cx8="http://schemas.microsoft.com/office/drawing/2016/5/14/chartex" xmlns:mc="http://schemas.openxmlformats.org/markup-compatibility/2006" xmlns:aink="http://schemas.microsoft.com/office/drawing/2016/ink" xmlns:am3d="http://schemas.microsoft.com/office/drawing/2017/model3d" xmlns:o="urn:schemas-microsoft-com:office:office" xmlns:oel="http://schemas.microsoft.com/office/2019/extlst" xmlns:r="http://schemas.openxmlformats.org/officeDocument/2006/relationships" xmlns:m="http://schemas.openxmlformats.org/officeDocument/2006/math" xmlns:v="urn:schemas-microsoft-com:vml" xmlns:wp14="http://schemas.microsoft.com/office/word/2010/wordprocessingDrawing" xmlns:wp="http://schemas.openxmlformats.org/drawingml/2006/wordprocessingDrawing" xmlns:w10="urn:schemas-microsoft-com:office:word" xmlns:w="http://schemas.openxmlformats.org/wordprocessingml/2006/main" xmlns:w14="http://schemas.microsoft.com/office/word/2010/wordml" xmlns:w15="http://schemas.microsoft.com/office/word/2012/wordml" xmlns:w16cex="http://schemas.microsoft.com/office/word/2018/wordml/cex" xmlns:w16cid="http://schemas.microsoft.com/office/word/2016/wordml/cid" xmlns:w16="http://schemas.microsoft.com/office/word/2018/wordml" xmlns:w16du="http://schemas.microsoft.com/office/word/2023/wordml/word16du" xmlns:w16sdtdh="http://schemas.microsoft.com/office/word/2020/wordml/sdtdatahash" xmlns:w16sdtfl="http://schemas.microsoft.com/office/word/2024/wordml/sdtformatlock" xmlns:w16se="http://schemas.microsoft.com/office/word/2015/wordml/symex" xmlns:wpg="http://schemas.microsoft.com/office/word/2010/wordprocessingGroup" xmlns:wpi="http://schemas.microsoft.com/office/word/2010/wordprocessingInk" xmlns:wne="http://schemas.microsoft.com/office/word/2006/wordml" xmlns:wps="http://schemas.microsoft.com/office/word/2010/wordprocessingShape" mc:Ignorable="w14 w15 w16se w16cid w16 w16cex w16sdtdh w16sdtfl w16du wp14">
   <w:endnote w:type="separator" w:id="-1">
     <w:p>
       <w:pPr>
@@ -2303,7 +3631,7 @@
 </file>
 
 <file path=word/footer1.xml><?xml version="1.0" encoding="utf-8"?>
-<w:ftr xmlns:wpc="http://schemas.microsoft.com/office/word/2010/wordprocessingCanvas" xmlns:cx="http://schemas.microsoft.com/office/drawing/2014/chartex" xmlns:cx1="http://schemas.microsoft.com/office/drawing/2015/9/8/chartex" xmlns:cx2="http://schemas.microsoft.com/office/drawing/2015/10/21/chartex" xmlns:cx3="http://schemas.microsoft.com/office/drawing/2016/5/9/chartex" xmlns:cx4="http://schemas.microsoft.com/office/drawing/2016/5/10/chartex" xmlns:cx5="http://schemas.microsoft.com/office/drawing/2016/5/11/chartex" xmlns:cx6="http://schemas.microsoft.com/office/drawing/2016/5/12/chartex" xmlns:cx7="http://schemas.microsoft.com/office/drawing/2016/5/13/chartex" xmlns:cx8="http://schemas.microsoft.com/office/drawing/2016/5/14/chartex" xmlns:mc="http://schemas.openxmlformats.org/markup-compatibility/2006" xmlns:aink="http://schemas.microsoft.com/office/drawing/2016/ink" xmlns:am3d="http://schemas.microsoft.com/office/drawing/2017/model3d" xmlns:o="urn:schemas-microsoft-com:office:office" xmlns:r="http://schemas.openxmlformats.org/officeDocument/2006/relationships" xmlns:m="http://schemas.openxmlformats.org/officeDocument/2006/math" xmlns:v="urn:schemas-microsoft-com:vml" xmlns:wp14="http://schemas.microsoft.com/office/word/2010/wordprocessingDrawing" xmlns:wp="http://schemas.openxmlformats.org/drawingml/2006/wordprocessingDrawing" xmlns:w10="urn:schemas-microsoft-com:office:word" xmlns:w="http://schemas.openxmlformats.org/wordprocessingml/2006/main" xmlns:w14="http://schemas.microsoft.com/office/word/2010/wordml" xmlns:w15="http://schemas.microsoft.com/office/word/2012/wordml" xmlns:w16cid="http://schemas.microsoft.com/office/word/2016/wordml/cid" xmlns:w16se="http://schemas.microsoft.com/office/word/2015/wordml/symex" xmlns:wpg="http://schemas.microsoft.com/office/word/2010/wordprocessingGroup" xmlns:wpi="http://schemas.microsoft.com/office/word/2010/wordprocessingInk" xmlns:wne="http://schemas.microsoft.com/office/word/2006/wordml" xmlns:wps="http://schemas.microsoft.com/office/word/2010/wordprocessingShape" mc:Ignorable="w14 w15 w16se w16cid wp14">
+<w:ftr xmlns:wpc="http://schemas.microsoft.com/office/word/2010/wordprocessingCanvas" xmlns:cx="http://schemas.microsoft.com/office/drawing/2014/chartex" xmlns:cx1="http://schemas.microsoft.com/office/drawing/2015/9/8/chartex" xmlns:cx2="http://schemas.microsoft.com/office/drawing/2015/10/21/chartex" xmlns:cx3="http://schemas.microsoft.com/office/drawing/2016/5/9/chartex" xmlns:cx4="http://schemas.microsoft.com/office/drawing/2016/5/10/chartex" xmlns:cx5="http://schemas.microsoft.com/office/drawing/2016/5/11/chartex" xmlns:cx6="http://schemas.microsoft.com/office/drawing/2016/5/12/chartex" xmlns:cx7="http://schemas.microsoft.com/office/drawing/2016/5/13/chartex" xmlns:cx8="http://schemas.microsoft.com/office/drawing/2016/5/14/chartex" xmlns:mc="http://schemas.openxmlformats.org/markup-compatibility/2006" xmlns:aink="http://schemas.microsoft.com/office/drawing/2016/ink" xmlns:am3d="http://schemas.microsoft.com/office/drawing/2017/model3d" xmlns:o="urn:schemas-microsoft-com:office:office" xmlns:oel="http://schemas.microsoft.com/office/2019/extlst" xmlns:r="http://schemas.openxmlformats.org/officeDocument/2006/relationships" xmlns:m="http://schemas.openxmlformats.org/officeDocument/2006/math" xmlns:v="urn:schemas-microsoft-com:vml" xmlns:wp14="http://schemas.microsoft.com/office/word/2010/wordprocessingDrawing" xmlns:wp="http://schemas.openxmlformats.org/drawingml/2006/wordprocessingDrawing" xmlns:w10="urn:schemas-microsoft-com:office:word" xmlns:w="http://schemas.openxmlformats.org/wordprocessingml/2006/main" xmlns:w14="http://schemas.microsoft.com/office/word/2010/wordml" xmlns:w15="http://schemas.microsoft.com/office/word/2012/wordml" xmlns:w16cex="http://schemas.microsoft.com/office/word/2018/wordml/cex" xmlns:w16cid="http://schemas.microsoft.com/office/word/2016/wordml/cid" xmlns:w16="http://schemas.microsoft.com/office/word/2018/wordml" xmlns:w16du="http://schemas.microsoft.com/office/word/2023/wordml/word16du" xmlns:w16sdtdh="http://schemas.microsoft.com/office/word/2020/wordml/sdtdatahash" xmlns:w16sdtfl="http://schemas.microsoft.com/office/word/2024/wordml/sdtformatlock" xmlns:w16se="http://schemas.microsoft.com/office/word/2015/wordml/symex" xmlns:wpg="http://schemas.microsoft.com/office/word/2010/wordprocessingGroup" xmlns:wpi="http://schemas.microsoft.com/office/word/2010/wordprocessingInk" xmlns:wne="http://schemas.microsoft.com/office/word/2006/wordml" xmlns:wps="http://schemas.microsoft.com/office/word/2010/wordprocessingShape" mc:Ignorable="w14 w15 w16se w16cid w16 w16cex w16sdtdh w16sdtfl w16du wp14">
   <w:p>
     <w:pPr>
       <w:pBdr>
@@ -2320,7 +3648,7 @@
     </w:pPr>
     <w:r>
       <w:pict w14:anchorId="6F30B4F6">
-        <v:rect id="_x0000_i1039" style="width:0;height:1.5pt" o:hralign="center" o:hrstd="t" o:hr="t" fillcolor="#a0a0a0" stroked="f"/>
+        <v:rect id="_x0000_i1025" style="width:0;height:1.5pt" o:hralign="center" o:hrstd="t" o:hr="t" fillcolor="#a0a0a0" stroked="f"/>
       </w:pict>
     </w:r>
   </w:p>
@@ -2337,36 +3665,69 @@
         <w:tab w:val="center" w:pos="4680"/>
         <w:tab w:val="right" w:pos="9360"/>
       </w:tabs>
+      <w:rPr>
+        <w:lang w:val="fr-CA"/>
+      </w:rPr>
     </w:pPr>
     <w:r>
+      <w:rPr>
+        <w:lang w:val="fr-CA"/>
+      </w:rPr>
       <w:t xml:space="preserve">Document de </w:t>
     </w:r>
     <w:r>
+      <w:rPr>
+        <w:lang w:val="fr-CA"/>
+      </w:rPr>
       <w:t>d</w:t>
     </w:r>
     <w:r>
-      <w:t xml:space="preserve">éfinition L’Attaque </w:t>
+      <w:rPr>
+        <w:lang w:val="fr-CA"/>
+      </w:rPr>
+      <w:t>éfinition L’Attaque</w:t>
     </w:r>
     <w:r>
+      <w:rPr>
+        <w:lang w:val="fr-CA"/>
+      </w:rPr>
       <w:t>, C</w:t>
     </w:r>
     <w:r>
+      <w:rPr>
+        <w:lang w:val="fr-CA"/>
+      </w:rPr>
       <w:t>6</w:t>
     </w:r>
     <w:r>
+      <w:rPr>
+        <w:lang w:val="fr-CA"/>
+      </w:rPr>
       <w:t>1</w:t>
     </w:r>
     <w:r>
+      <w:rPr>
+        <w:lang w:val="fr-CA"/>
+      </w:rPr>
       <w:tab/>
       <w:t>202</w:t>
     </w:r>
     <w:r>
+      <w:rPr>
+        <w:lang w:val="fr-CA"/>
+      </w:rPr>
       <w:t>6</w:t>
     </w:r>
     <w:r>
+      <w:rPr>
+        <w:lang w:val="fr-CA"/>
+      </w:rPr>
       <w:t xml:space="preserve"> hiver</w:t>
     </w:r>
     <w:r>
+      <w:rPr>
+        <w:lang w:val="fr-CA"/>
+      </w:rPr>
       <w:tab/>
       <w:t>p.</w:t>
     </w:r>
@@ -2374,6 +3735,9 @@
       <w:fldChar w:fldCharType="begin"/>
     </w:r>
     <w:r>
+      <w:rPr>
+        <w:lang w:val="fr-CA"/>
+      </w:rPr>
       <w:instrText>PAGE</w:instrText>
     </w:r>
     <w:r>
@@ -2382,6 +3746,7 @@
     <w:r>
       <w:rPr>
         <w:noProof/>
+        <w:lang w:val="fr-CA"/>
       </w:rPr>
       <w:t>1</w:t>
     </w:r>
@@ -2393,7 +3758,7 @@
 </file>
 
 <file path=word/footnotes.xml><?xml version="1.0" encoding="utf-8"?>
-<w:footnotes xmlns:wpc="http://schemas.microsoft.com/office/word/2010/wordprocessingCanvas" xmlns:cx="http://schemas.microsoft.com/office/drawing/2014/chartex" xmlns:cx1="http://schemas.microsoft.com/office/drawing/2015/9/8/chartex" xmlns:cx2="http://schemas.microsoft.com/office/drawing/2015/10/21/chartex" xmlns:cx3="http://schemas.microsoft.com/office/drawing/2016/5/9/chartex" xmlns:cx4="http://schemas.microsoft.com/office/drawing/2016/5/10/chartex" xmlns:cx5="http://schemas.microsoft.com/office/drawing/2016/5/11/chartex" xmlns:cx6="http://schemas.microsoft.com/office/drawing/2016/5/12/chartex" xmlns:cx7="http://schemas.microsoft.com/office/drawing/2016/5/13/chartex" xmlns:cx8="http://schemas.microsoft.com/office/drawing/2016/5/14/chartex" xmlns:mc="http://schemas.openxmlformats.org/markup-compatibility/2006" xmlns:aink="http://schemas.microsoft.com/office/drawing/2016/ink" xmlns:am3d="http://schemas.microsoft.com/office/drawing/2017/model3d" xmlns:o="urn:schemas-microsoft-com:office:office" xmlns:r="http://schemas.openxmlformats.org/officeDocument/2006/relationships" xmlns:m="http://schemas.openxmlformats.org/officeDocument/2006/math" xmlns:v="urn:schemas-microsoft-com:vml" xmlns:wp14="http://schemas.microsoft.com/office/word/2010/wordprocessingDrawing" xmlns:wp="http://schemas.openxmlformats.org/drawingml/2006/wordprocessingDrawing" xmlns:w10="urn:schemas-microsoft-com:office:word" xmlns:w="http://schemas.openxmlformats.org/wordprocessingml/2006/main" xmlns:w14="http://schemas.microsoft.com/office/word/2010/wordml" xmlns:w15="http://schemas.microsoft.com/office/word/2012/wordml" xmlns:w16cid="http://schemas.microsoft.com/office/word/2016/wordml/cid" xmlns:w16se="http://schemas.microsoft.com/office/word/2015/wordml/symex" xmlns:wpg="http://schemas.microsoft.com/office/word/2010/wordprocessingGroup" xmlns:wpi="http://schemas.microsoft.com/office/word/2010/wordprocessingInk" xmlns:wne="http://schemas.microsoft.com/office/word/2006/wordml" xmlns:wps="http://schemas.microsoft.com/office/word/2010/wordprocessingShape" mc:Ignorable="w14 w15 w16se w16cid wp14">
+<w:footnotes xmlns:wpc="http://schemas.microsoft.com/office/word/2010/wordprocessingCanvas" xmlns:cx="http://schemas.microsoft.com/office/drawing/2014/chartex" xmlns:cx1="http://schemas.microsoft.com/office/drawing/2015/9/8/chartex" xmlns:cx2="http://schemas.microsoft.com/office/drawing/2015/10/21/chartex" xmlns:cx3="http://schemas.microsoft.com/office/drawing/2016/5/9/chartex" xmlns:cx4="http://schemas.microsoft.com/office/drawing/2016/5/10/chartex" xmlns:cx5="http://schemas.microsoft.com/office/drawing/2016/5/11/chartex" xmlns:cx6="http://schemas.microsoft.com/office/drawing/2016/5/12/chartex" xmlns:cx7="http://schemas.microsoft.com/office/drawing/2016/5/13/chartex" xmlns:cx8="http://schemas.microsoft.com/office/drawing/2016/5/14/chartex" xmlns:mc="http://schemas.openxmlformats.org/markup-compatibility/2006" xmlns:aink="http://schemas.microsoft.com/office/drawing/2016/ink" xmlns:am3d="http://schemas.microsoft.com/office/drawing/2017/model3d" xmlns:o="urn:schemas-microsoft-com:office:office" xmlns:oel="http://schemas.microsoft.com/office/2019/extlst" xmlns:r="http://schemas.openxmlformats.org/officeDocument/2006/relationships" xmlns:m="http://schemas.openxmlformats.org/officeDocument/2006/math" xmlns:v="urn:schemas-microsoft-com:vml" xmlns:wp14="http://schemas.microsoft.com/office/word/2010/wordprocessingDrawing" xmlns:wp="http://schemas.openxmlformats.org/drawingml/2006/wordprocessingDrawing" xmlns:w10="urn:schemas-microsoft-com:office:word" xmlns:w="http://schemas.openxmlformats.org/wordprocessingml/2006/main" xmlns:w14="http://schemas.microsoft.com/office/word/2010/wordml" xmlns:w15="http://schemas.microsoft.com/office/word/2012/wordml" xmlns:w16cex="http://schemas.microsoft.com/office/word/2018/wordml/cex" xmlns:w16cid="http://schemas.microsoft.com/office/word/2016/wordml/cid" xmlns:w16="http://schemas.microsoft.com/office/word/2018/wordml" xmlns:w16du="http://schemas.microsoft.com/office/word/2023/wordml/word16du" xmlns:w16sdtdh="http://schemas.microsoft.com/office/word/2020/wordml/sdtdatahash" xmlns:w16sdtfl="http://schemas.microsoft.com/office/word/2024/wordml/sdtformatlock" xmlns:w16se="http://schemas.microsoft.com/office/word/2015/wordml/symex" xmlns:wpg="http://schemas.microsoft.com/office/word/2010/wordprocessingGroup" xmlns:wpi="http://schemas.microsoft.com/office/word/2010/wordprocessingInk" xmlns:wne="http://schemas.microsoft.com/office/word/2006/wordml" xmlns:wps="http://schemas.microsoft.com/office/word/2010/wordprocessingShape" mc:Ignorable="w14 w15 w16se w16cid w16 w16cex w16sdtdh w16sdtfl w16du wp14">
   <w:footnote w:type="separator" w:id="-1">
     <w:p>
       <w:pPr>
@@ -2418,7 +3783,7 @@
 </file>
 
 <file path=word/numbering.xml><?xml version="1.0" encoding="utf-8"?>
-<w:numbering xmlns:wpc="http://schemas.microsoft.com/office/word/2010/wordprocessingCanvas" xmlns:cx="http://schemas.microsoft.com/office/drawing/2014/chartex" xmlns:cx1="http://schemas.microsoft.com/office/drawing/2015/9/8/chartex" xmlns:cx2="http://schemas.microsoft.com/office/drawing/2015/10/21/chartex" xmlns:cx3="http://schemas.microsoft.com/office/drawing/2016/5/9/chartex" xmlns:cx4="http://schemas.microsoft.com/office/drawing/2016/5/10/chartex" xmlns:cx5="http://schemas.microsoft.com/office/drawing/2016/5/11/chartex" xmlns:cx6="http://schemas.microsoft.com/office/drawing/2016/5/12/chartex" xmlns:cx7="http://schemas.microsoft.com/office/drawing/2016/5/13/chartex" xmlns:cx8="http://schemas.microsoft.com/office/drawing/2016/5/14/chartex" xmlns:mc="http://schemas.openxmlformats.org/markup-compatibility/2006" xmlns:aink="http://schemas.microsoft.com/office/drawing/2016/ink" xmlns:am3d="http://schemas.microsoft.com/office/drawing/2017/model3d" xmlns:o="urn:schemas-microsoft-com:office:office" xmlns:r="http://schemas.openxmlformats.org/officeDocument/2006/relationships" xmlns:m="http://schemas.openxmlformats.org/officeDocument/2006/math" xmlns:v="urn:schemas-microsoft-com:vml" xmlns:wp14="http://schemas.microsoft.com/office/word/2010/wordprocessingDrawing" xmlns:wp="http://schemas.openxmlformats.org/drawingml/2006/wordprocessingDrawing" xmlns:w10="urn:schemas-microsoft-com:office:word" xmlns:w="http://schemas.openxmlformats.org/wordprocessingml/2006/main" xmlns:w14="http://schemas.microsoft.com/office/word/2010/wordml" xmlns:w15="http://schemas.microsoft.com/office/word/2012/wordml" xmlns:w16cid="http://schemas.microsoft.com/office/word/2016/wordml/cid" xmlns:w16se="http://schemas.microsoft.com/office/word/2015/wordml/symex" xmlns:wpg="http://schemas.microsoft.com/office/word/2010/wordprocessingGroup" xmlns:wpi="http://schemas.microsoft.com/office/word/2010/wordprocessingInk" xmlns:wne="http://schemas.microsoft.com/office/word/2006/wordml" xmlns:wps="http://schemas.microsoft.com/office/word/2010/wordprocessingShape" mc:Ignorable="w14 w15 w16se w16cid wp14">
+<w:numbering xmlns:wpc="http://schemas.microsoft.com/office/word/2010/wordprocessingCanvas" xmlns:cx="http://schemas.microsoft.com/office/drawing/2014/chartex" xmlns:cx1="http://schemas.microsoft.com/office/drawing/2015/9/8/chartex" xmlns:cx2="http://schemas.microsoft.com/office/drawing/2015/10/21/chartex" xmlns:cx3="http://schemas.microsoft.com/office/drawing/2016/5/9/chartex" xmlns:cx4="http://schemas.microsoft.com/office/drawing/2016/5/10/chartex" xmlns:cx5="http://schemas.microsoft.com/office/drawing/2016/5/11/chartex" xmlns:cx6="http://schemas.microsoft.com/office/drawing/2016/5/12/chartex" xmlns:cx7="http://schemas.microsoft.com/office/drawing/2016/5/13/chartex" xmlns:cx8="http://schemas.microsoft.com/office/drawing/2016/5/14/chartex" xmlns:mc="http://schemas.openxmlformats.org/markup-compatibility/2006" xmlns:aink="http://schemas.microsoft.com/office/drawing/2016/ink" xmlns:am3d="http://schemas.microsoft.com/office/drawing/2017/model3d" xmlns:o="urn:schemas-microsoft-com:office:office" xmlns:oel="http://schemas.microsoft.com/office/2019/extlst" xmlns:r="http://schemas.openxmlformats.org/officeDocument/2006/relationships" xmlns:m="http://schemas.openxmlformats.org/officeDocument/2006/math" xmlns:v="urn:schemas-microsoft-com:vml" xmlns:wp14="http://schemas.microsoft.com/office/word/2010/wordprocessingDrawing" xmlns:wp="http://schemas.openxmlformats.org/drawingml/2006/wordprocessingDrawing" xmlns:w10="urn:schemas-microsoft-com:office:word" xmlns:w="http://schemas.openxmlformats.org/wordprocessingml/2006/main" xmlns:w14="http://schemas.microsoft.com/office/word/2010/wordml" xmlns:w15="http://schemas.microsoft.com/office/word/2012/wordml" xmlns:w16cex="http://schemas.microsoft.com/office/word/2018/wordml/cex" xmlns:w16cid="http://schemas.microsoft.com/office/word/2016/wordml/cid" xmlns:w16="http://schemas.microsoft.com/office/word/2018/wordml" xmlns:w16du="http://schemas.microsoft.com/office/word/2023/wordml/word16du" xmlns:w16sdtdh="http://schemas.microsoft.com/office/word/2020/wordml/sdtdatahash" xmlns:w16sdtfl="http://schemas.microsoft.com/office/word/2024/wordml/sdtformatlock" xmlns:w16se="http://schemas.microsoft.com/office/word/2015/wordml/symex" xmlns:wpg="http://schemas.microsoft.com/office/word/2010/wordprocessingGroup" xmlns:wpi="http://schemas.microsoft.com/office/word/2010/wordprocessingInk" xmlns:wne="http://schemas.microsoft.com/office/word/2006/wordml" xmlns:wps="http://schemas.microsoft.com/office/word/2010/wordprocessingShape" mc:Ignorable="w14 w15 w16se w16cid w16 w16cex w16sdtdh w16sdtfl w16du wp14">
   <w:abstractNum w:abstractNumId="0" w15:restartNumberingAfterBreak="0">
     <w:nsid w:val="08155098"/>
     <w:multiLevelType w:val="multilevel"/>
@@ -4644,65 +6009,73 @@
       </w:rPr>
     </w:lvl>
   </w:abstractNum>
-  <w:num w:numId="1">
+  <w:num w:numId="1" w16cid:durableId="2036615892">
     <w:abstractNumId w:val="1"/>
   </w:num>
-  <w:num w:numId="2">
+  <w:num w:numId="2" w16cid:durableId="115370699">
     <w:abstractNumId w:val="10"/>
   </w:num>
-  <w:num w:numId="3">
+  <w:num w:numId="3" w16cid:durableId="332493804">
     <w:abstractNumId w:val="5"/>
   </w:num>
-  <w:num w:numId="4">
+  <w:num w:numId="4" w16cid:durableId="981499495">
     <w:abstractNumId w:val="12"/>
   </w:num>
-  <w:num w:numId="5">
+  <w:num w:numId="5" w16cid:durableId="753167456">
     <w:abstractNumId w:val="2"/>
   </w:num>
-  <w:num w:numId="6">
+  <w:num w:numId="6" w16cid:durableId="484664255">
     <w:abstractNumId w:val="0"/>
   </w:num>
-  <w:num w:numId="7">
+  <w:num w:numId="7" w16cid:durableId="399211033">
     <w:abstractNumId w:val="9"/>
   </w:num>
-  <w:num w:numId="8">
+  <w:num w:numId="8" w16cid:durableId="2112238524">
     <w:abstractNumId w:val="3"/>
   </w:num>
-  <w:num w:numId="9">
+  <w:num w:numId="9" w16cid:durableId="834998643">
     <w:abstractNumId w:val="11"/>
   </w:num>
-  <w:num w:numId="10">
+  <w:num w:numId="10" w16cid:durableId="1290820209">
     <w:abstractNumId w:val="8"/>
   </w:num>
-  <w:num w:numId="11">
+  <w:num w:numId="11" w16cid:durableId="321543850">
     <w:abstractNumId w:val="13"/>
   </w:num>
-  <w:num w:numId="12">
+  <w:num w:numId="12" w16cid:durableId="243610125">
     <w:abstractNumId w:val="4"/>
   </w:num>
-  <w:num w:numId="13">
+  <w:num w:numId="13" w16cid:durableId="931277377">
     <w:abstractNumId w:val="7"/>
   </w:num>
-  <w:num w:numId="14">
+  <w:num w:numId="14" w16cid:durableId="1105661180">
     <w:abstractNumId w:val="15"/>
   </w:num>
-  <w:num w:numId="15">
+  <w:num w:numId="15" w16cid:durableId="225148750">
     <w:abstractNumId w:val="6"/>
   </w:num>
-  <w:num w:numId="16">
+  <w:num w:numId="16" w16cid:durableId="676619642">
     <w:abstractNumId w:val="14"/>
   </w:num>
-  <w:num w:numId="17">
+  <w:num w:numId="17" w16cid:durableId="45842272">
     <w:abstractNumId w:val="16"/>
   </w:num>
-  <w:num w:numId="18">
+  <w:num w:numId="18" w16cid:durableId="931626517">
     <w:abstractNumId w:val="17"/>
   </w:num>
 </w:numbering>
 </file>
 
+<file path=word/people.xml><?xml version="1.0" encoding="utf-8"?>
+<w15:people xmlns:wpc="http://schemas.microsoft.com/office/word/2010/wordprocessingCanvas" xmlns:cx="http://schemas.microsoft.com/office/drawing/2014/chartex" xmlns:cx1="http://schemas.microsoft.com/office/drawing/2015/9/8/chartex" xmlns:cx2="http://schemas.microsoft.com/office/drawing/2015/10/21/chartex" xmlns:cx3="http://schemas.microsoft.com/office/drawing/2016/5/9/chartex" xmlns:cx4="http://schemas.microsoft.com/office/drawing/2016/5/10/chartex" xmlns:cx5="http://schemas.microsoft.com/office/drawing/2016/5/11/chartex" xmlns:cx6="http://schemas.microsoft.com/office/drawing/2016/5/12/chartex" xmlns:cx7="http://schemas.microsoft.com/office/drawing/2016/5/13/chartex" xmlns:cx8="http://schemas.microsoft.com/office/drawing/2016/5/14/chartex" xmlns:mc="http://schemas.openxmlformats.org/markup-compatibility/2006" xmlns:aink="http://schemas.microsoft.com/office/drawing/2016/ink" xmlns:am3d="http://schemas.microsoft.com/office/drawing/2017/model3d" xmlns:o="urn:schemas-microsoft-com:office:office" xmlns:oel="http://schemas.microsoft.com/office/2019/extlst" xmlns:r="http://schemas.openxmlformats.org/officeDocument/2006/relationships" xmlns:m="http://schemas.openxmlformats.org/officeDocument/2006/math" xmlns:v="urn:schemas-microsoft-com:vml" xmlns:wp14="http://schemas.microsoft.com/office/word/2010/wordprocessingDrawing" xmlns:wp="http://schemas.openxmlformats.org/drawingml/2006/wordprocessingDrawing" xmlns:w10="urn:schemas-microsoft-com:office:word" xmlns:w="http://schemas.openxmlformats.org/wordprocessingml/2006/main" xmlns:w14="http://schemas.microsoft.com/office/word/2010/wordml" xmlns:w15="http://schemas.microsoft.com/office/word/2012/wordml" xmlns:w16cex="http://schemas.microsoft.com/office/word/2018/wordml/cex" xmlns:w16cid="http://schemas.microsoft.com/office/word/2016/wordml/cid" xmlns:w16="http://schemas.microsoft.com/office/word/2018/wordml" xmlns:w16du="http://schemas.microsoft.com/office/word/2023/wordml/word16du" xmlns:w16sdtdh="http://schemas.microsoft.com/office/word/2020/wordml/sdtdatahash" xmlns:w16sdtfl="http://schemas.microsoft.com/office/word/2024/wordml/sdtformatlock" xmlns:w16se="http://schemas.microsoft.com/office/word/2015/wordml/symex" xmlns:wpg="http://schemas.microsoft.com/office/word/2010/wordprocessingGroup" xmlns:wpi="http://schemas.microsoft.com/office/word/2010/wordprocessingInk" xmlns:wne="http://schemas.microsoft.com/office/word/2006/wordml" xmlns:wps="http://schemas.microsoft.com/office/word/2010/wordprocessingShape" mc:Ignorable="w14 w15 w16se w16cid w16 w16cex w16sdtdh w16sdtfl w16du wp14">
+  <w15:person w15:author="Dupras Charlotte">
+    <w15:presenceInfo w15:providerId="AD" w15:userId="S::e.cdupras@etu.cvm.qc.ca::95c676b0-4852-407f-b1c2-872caa5e5efa"/>
+  </w15:person>
+</w15:people>
+</file>
+
 <file path=word/styles.xml><?xml version="1.0" encoding="utf-8"?>
-<w:styles xmlns:mc="http://schemas.openxmlformats.org/markup-compatibility/2006" xmlns:r="http://schemas.openxmlformats.org/officeDocument/2006/relationships" xmlns:w="http://schemas.openxmlformats.org/wordprocessingml/2006/main" xmlns:w14="http://schemas.microsoft.com/office/word/2010/wordml" xmlns:w15="http://schemas.microsoft.com/office/word/2012/wordml" xmlns:w16cid="http://schemas.microsoft.com/office/word/2016/wordml/cid" xmlns:w16se="http://schemas.microsoft.com/office/word/2015/wordml/symex" mc:Ignorable="w14 w15 w16se w16cid">
+<w:styles xmlns:mc="http://schemas.openxmlformats.org/markup-compatibility/2006" xmlns:r="http://schemas.openxmlformats.org/officeDocument/2006/relationships" xmlns:w="http://schemas.openxmlformats.org/wordprocessingml/2006/main" xmlns:w14="http://schemas.microsoft.com/office/word/2010/wordml" xmlns:w15="http://schemas.microsoft.com/office/word/2012/wordml" xmlns:w16cex="http://schemas.microsoft.com/office/word/2018/wordml/cex" xmlns:w16cid="http://schemas.microsoft.com/office/word/2016/wordml/cid" xmlns:w16="http://schemas.microsoft.com/office/word/2018/wordml" xmlns:w16du="http://schemas.microsoft.com/office/word/2023/wordml/word16du" xmlns:w16sdtdh="http://schemas.microsoft.com/office/word/2020/wordml/sdtdatahash" xmlns:w16sdtfl="http://schemas.microsoft.com/office/word/2024/wordml/sdtformatlock" xmlns:w16se="http://schemas.microsoft.com/office/word/2015/wordml/symex" mc:Ignorable="w14 w15 w16se w16cid w16 w16cex w16sdtdh w16sdtfl w16du">
   <w:docDefaults>
     <w:rPrDefault>
       <w:rPr>
@@ -4718,7 +6091,7 @@
       </w:pPr>
     </w:pPrDefault>
   </w:docDefaults>
-  <w:latentStyles w:defLockedState="0" w:defUIPriority="99" w:defSemiHidden="0" w:defUnhideWhenUsed="0" w:defQFormat="0" w:count="377">
+  <w:latentStyles w:defLockedState="0" w:defUIPriority="99" w:defSemiHidden="0" w:defUnhideWhenUsed="0" w:defQFormat="0" w:count="376">
     <w:lsdException w:name="Normal" w:uiPriority="0" w:qFormat="1"/>
     <w:lsdException w:name="heading 1" w:uiPriority="9" w:qFormat="1"/>
     <w:lsdException w:name="heading 2" w:semiHidden="1" w:uiPriority="9" w:unhideWhenUsed="1" w:qFormat="1"/>
@@ -5095,7 +6468,6 @@
     <w:lsdException w:name="Hashtag" w:semiHidden="1" w:unhideWhenUsed="1"/>
     <w:lsdException w:name="Unresolved Mention" w:semiHidden="1" w:unhideWhenUsed="1"/>
     <w:lsdException w:name="Smart Link" w:semiHidden="1" w:unhideWhenUsed="1"/>
-    <w:lsdException w:name="Smart Link Error" w:semiHidden="1" w:unhideWhenUsed="1"/>
   </w:latentStyles>
   <w:style w:type="paragraph" w:default="1" w:styleId="Normal">
     <w:name w:val="Normal"/>
@@ -5219,6 +6591,7 @@
   <w:style w:type="character" w:default="1" w:styleId="Policepardfaut">
     <w:name w:val="Default Paragraph Font"/>
     <w:uiPriority w:val="1"/>
+    <w:semiHidden/>
     <w:unhideWhenUsed/>
   </w:style>
   <w:style w:type="table" w:default="1" w:styleId="TableauNormal">
@@ -5520,7 +6893,6 @@
     <w:name w:val="Normal (Web)"/>
     <w:basedOn w:val="Normal"/>
     <w:uiPriority w:val="99"/>
-    <w:semiHidden/>
     <w:unhideWhenUsed/>
     <w:rsid w:val="00F155BD"/>
     <w:pPr>
@@ -5603,6 +6975,72 @@
       <w:color w:val="666666"/>
       <w:sz w:val="24"/>
       <w:szCs w:val="24"/>
+    </w:rPr>
+  </w:style>
+  <w:style w:type="character" w:styleId="Marquedecommentaire">
+    <w:name w:val="annotation reference"/>
+    <w:basedOn w:val="Policepardfaut"/>
+    <w:uiPriority w:val="99"/>
+    <w:semiHidden/>
+    <w:unhideWhenUsed/>
+    <w:rsid w:val="00D032E8"/>
+    <w:rPr>
+      <w:sz w:val="16"/>
+      <w:szCs w:val="16"/>
+    </w:rPr>
+  </w:style>
+  <w:style w:type="paragraph" w:styleId="Commentaire">
+    <w:name w:val="annotation text"/>
+    <w:basedOn w:val="Normal"/>
+    <w:link w:val="CommentaireCar"/>
+    <w:uiPriority w:val="99"/>
+    <w:unhideWhenUsed/>
+    <w:rsid w:val="00D032E8"/>
+    <w:pPr>
+      <w:spacing w:line="240" w:lineRule="auto"/>
+    </w:pPr>
+    <w:rPr>
+      <w:sz w:val="20"/>
+      <w:szCs w:val="20"/>
+    </w:rPr>
+  </w:style>
+  <w:style w:type="character" w:customStyle="1" w:styleId="CommentaireCar">
+    <w:name w:val="Commentaire Car"/>
+    <w:basedOn w:val="Policepardfaut"/>
+    <w:link w:val="Commentaire"/>
+    <w:uiPriority w:val="99"/>
+    <w:rsid w:val="00D032E8"/>
+    <w:rPr>
+      <w:sz w:val="20"/>
+      <w:szCs w:val="20"/>
+    </w:rPr>
+  </w:style>
+  <w:style w:type="paragraph" w:styleId="Objetducommentaire">
+    <w:name w:val="annotation subject"/>
+    <w:basedOn w:val="Commentaire"/>
+    <w:next w:val="Commentaire"/>
+    <w:link w:val="ObjetducommentaireCar"/>
+    <w:uiPriority w:val="99"/>
+    <w:semiHidden/>
+    <w:unhideWhenUsed/>
+    <w:rsid w:val="00D032E8"/>
+    <w:rPr>
+      <w:b/>
+      <w:bCs/>
+    </w:rPr>
+  </w:style>
+  <w:style w:type="character" w:customStyle="1" w:styleId="ObjetducommentaireCar">
+    <w:name w:val="Objet du commentaire Car"/>
+    <w:basedOn w:val="CommentaireCar"/>
+    <w:link w:val="Objetducommentaire"/>
+    <w:uiPriority w:val="99"/>
+    <w:semiHidden/>
+    <w:rsid w:val="00D032E8"/>
+    <w:rPr>
+      <w:b/>
+      <w:bCs/>
+      <w:sz w:val="20"/>
+      <w:szCs w:val="20"/>
     </w:rPr>
   </w:style>
 </w:styles>

</xml_diff>